<commit_message>
cập nhật chức năng kho hàng
</commit_message>
<xml_diff>
--- a/BaoCao/110122175_NHKT_KLTN_2026.docx
+++ b/BaoCao/110122175_NHKT_KLTN_2026.docx
@@ -1163,7 +1163,7 @@
           <w:numId w:val="0"/>
         </w:numPr>
       </w:pPr>
-      <w:bookmarkStart w:id="1" w:name="_Toc20345"/>
+      <w:bookmarkStart w:id="1" w:name="_Toc31036"/>
       <w:r>
         <w:t>MỤC LỤC</w:t>
       </w:r>
@@ -1190,7 +1190,7 @@
         <w:fldChar w:fldCharType="begin"/>
       </w:r>
       <w:r>
-        <w:instrText xml:space="preserve"> HYPERLINK \l _Toc20345 </w:instrText>
+        <w:instrText xml:space="preserve"> HYPERLINK \l _Toc31036 </w:instrText>
       </w:r>
       <w:r>
         <w:fldChar w:fldCharType="separate"/>
@@ -1205,7 +1205,7 @@
         <w:fldChar w:fldCharType="begin"/>
       </w:r>
       <w:r>
-        <w:instrText xml:space="preserve"> PAGEREF _Toc20345 \h </w:instrText>
+        <w:instrText xml:space="preserve"> PAGEREF _Toc31036 \h </w:instrText>
       </w:r>
       <w:r>
         <w:fldChar w:fldCharType="separate"/>
@@ -1231,7 +1231,7 @@
         <w:fldChar w:fldCharType="begin"/>
       </w:r>
       <w:r>
-        <w:instrText xml:space="preserve"> HYPERLINK \l _Toc17590 </w:instrText>
+        <w:instrText xml:space="preserve"> HYPERLINK \l _Toc32053 </w:instrText>
       </w:r>
       <w:r>
         <w:fldChar w:fldCharType="separate"/>
@@ -1249,7 +1249,7 @@
         <w:fldChar w:fldCharType="begin"/>
       </w:r>
       <w:r>
-        <w:instrText xml:space="preserve"> PAGEREF _Toc17590 \h </w:instrText>
+        <w:instrText xml:space="preserve"> PAGEREF _Toc32053 \h </w:instrText>
       </w:r>
       <w:r>
         <w:fldChar w:fldCharType="separate"/>
@@ -1275,7 +1275,7 @@
         <w:fldChar w:fldCharType="begin"/>
       </w:r>
       <w:r>
-        <w:instrText xml:space="preserve"> HYPERLINK \l _Toc5429 </w:instrText>
+        <w:instrText xml:space="preserve"> HYPERLINK \l _Toc27230 </w:instrText>
       </w:r>
       <w:r>
         <w:fldChar w:fldCharType="separate"/>
@@ -1296,7 +1296,7 @@
         <w:fldChar w:fldCharType="begin"/>
       </w:r>
       <w:r>
-        <w:instrText xml:space="preserve"> PAGEREF _Toc5429 \h </w:instrText>
+        <w:instrText xml:space="preserve"> PAGEREF _Toc27230 \h </w:instrText>
       </w:r>
       <w:r>
         <w:fldChar w:fldCharType="separate"/>
@@ -1322,7 +1322,7 @@
         <w:fldChar w:fldCharType="begin"/>
       </w:r>
       <w:r>
-        <w:instrText xml:space="preserve"> HYPERLINK \l _Toc18053 </w:instrText>
+        <w:instrText xml:space="preserve"> HYPERLINK \l _Toc27409 </w:instrText>
       </w:r>
       <w:r>
         <w:fldChar w:fldCharType="separate"/>
@@ -1340,7 +1340,7 @@
         <w:fldChar w:fldCharType="begin"/>
       </w:r>
       <w:r>
-        <w:instrText xml:space="preserve"> PAGEREF _Toc18053 \h </w:instrText>
+        <w:instrText xml:space="preserve"> PAGEREF _Toc27409 \h </w:instrText>
       </w:r>
       <w:r>
         <w:fldChar w:fldCharType="separate"/>
@@ -1366,7 +1366,7 @@
         <w:fldChar w:fldCharType="begin"/>
       </w:r>
       <w:r>
-        <w:instrText xml:space="preserve"> HYPERLINK \l _Toc2804 </w:instrText>
+        <w:instrText xml:space="preserve"> HYPERLINK \l _Toc13856 </w:instrText>
       </w:r>
       <w:r>
         <w:fldChar w:fldCharType="separate"/>
@@ -1384,13 +1384,13 @@
         <w:fldChar w:fldCharType="begin"/>
       </w:r>
       <w:r>
-        <w:instrText xml:space="preserve"> PAGEREF _Toc2804 \h </w:instrText>
+        <w:instrText xml:space="preserve"> PAGEREF _Toc13856 \h </w:instrText>
       </w:r>
       <w:r>
         <w:fldChar w:fldCharType="separate"/>
       </w:r>
       <w:r>
-        <w:t>16</w:t>
+        <w:t>15</w:t>
       </w:r>
       <w:r>
         <w:fldChar w:fldCharType="end"/>
@@ -1410,7 +1410,7 @@
         <w:fldChar w:fldCharType="begin"/>
       </w:r>
       <w:r>
-        <w:instrText xml:space="preserve"> HYPERLINK \l _Toc18313 </w:instrText>
+        <w:instrText xml:space="preserve"> HYPERLINK \l _Toc15471 </w:instrText>
       </w:r>
       <w:r>
         <w:fldChar w:fldCharType="separate"/>
@@ -1437,7 +1437,7 @@
         <w:fldChar w:fldCharType="begin"/>
       </w:r>
       <w:r>
-        <w:instrText xml:space="preserve"> PAGEREF _Toc18313 \h </w:instrText>
+        <w:instrText xml:space="preserve"> PAGEREF _Toc15471 \h </w:instrText>
       </w:r>
       <w:r>
         <w:fldChar w:fldCharType="separate"/>
@@ -1463,7 +1463,7 @@
         <w:fldChar w:fldCharType="begin"/>
       </w:r>
       <w:r>
-        <w:instrText xml:space="preserve"> HYPERLINK \l _Toc11935 </w:instrText>
+        <w:instrText xml:space="preserve"> HYPERLINK \l _Toc17985 </w:instrText>
       </w:r>
       <w:r>
         <w:fldChar w:fldCharType="separate"/>
@@ -1489,7 +1489,7 @@
         <w:fldChar w:fldCharType="begin"/>
       </w:r>
       <w:r>
-        <w:instrText xml:space="preserve"> PAGEREF _Toc11935 \h </w:instrText>
+        <w:instrText xml:space="preserve"> PAGEREF _Toc17985 \h </w:instrText>
       </w:r>
       <w:r>
         <w:fldChar w:fldCharType="separate"/>
@@ -1515,7 +1515,7 @@
         <w:fldChar w:fldCharType="begin"/>
       </w:r>
       <w:r>
-        <w:instrText xml:space="preserve"> HYPERLINK \l _Toc3986 </w:instrText>
+        <w:instrText xml:space="preserve"> HYPERLINK \l _Toc6399 </w:instrText>
       </w:r>
       <w:r>
         <w:fldChar w:fldCharType="separate"/>
@@ -1541,7 +1541,7 @@
         <w:fldChar w:fldCharType="begin"/>
       </w:r>
       <w:r>
-        <w:instrText xml:space="preserve"> PAGEREF _Toc3986 \h </w:instrText>
+        <w:instrText xml:space="preserve"> PAGEREF _Toc6399 \h </w:instrText>
       </w:r>
       <w:r>
         <w:fldChar w:fldCharType="separate"/>
@@ -1567,7 +1567,7 @@
         <w:fldChar w:fldCharType="begin"/>
       </w:r>
       <w:r>
-        <w:instrText xml:space="preserve"> HYPERLINK \l _Toc9223 </w:instrText>
+        <w:instrText xml:space="preserve"> HYPERLINK \l _Toc15578 </w:instrText>
       </w:r>
       <w:r>
         <w:fldChar w:fldCharType="separate"/>
@@ -1593,7 +1593,7 @@
         <w:fldChar w:fldCharType="begin"/>
       </w:r>
       <w:r>
-        <w:instrText xml:space="preserve"> PAGEREF _Toc9223 \h </w:instrText>
+        <w:instrText xml:space="preserve"> PAGEREF _Toc15578 \h </w:instrText>
       </w:r>
       <w:r>
         <w:fldChar w:fldCharType="separate"/>
@@ -1619,7 +1619,7 @@
         <w:fldChar w:fldCharType="begin"/>
       </w:r>
       <w:r>
-        <w:instrText xml:space="preserve"> HYPERLINK \l _Toc4842 </w:instrText>
+        <w:instrText xml:space="preserve"> HYPERLINK \l _Toc30455 </w:instrText>
       </w:r>
       <w:r>
         <w:fldChar w:fldCharType="separate"/>
@@ -1645,7 +1645,7 @@
         <w:fldChar w:fldCharType="begin"/>
       </w:r>
       <w:r>
-        <w:instrText xml:space="preserve"> PAGEREF _Toc4842 \h </w:instrText>
+        <w:instrText xml:space="preserve"> PAGEREF _Toc30455 \h </w:instrText>
       </w:r>
       <w:r>
         <w:fldChar w:fldCharType="separate"/>
@@ -1671,7 +1671,7 @@
         <w:fldChar w:fldCharType="begin"/>
       </w:r>
       <w:r>
-        <w:instrText xml:space="preserve"> HYPERLINK \l _Toc2791 </w:instrText>
+        <w:instrText xml:space="preserve"> HYPERLINK \l _Toc10691 </w:instrText>
       </w:r>
       <w:r>
         <w:fldChar w:fldCharType="separate"/>
@@ -1697,7 +1697,7 @@
         <w:fldChar w:fldCharType="begin"/>
       </w:r>
       <w:r>
-        <w:instrText xml:space="preserve"> PAGEREF _Toc2791 \h </w:instrText>
+        <w:instrText xml:space="preserve"> PAGEREF _Toc10691 \h </w:instrText>
       </w:r>
       <w:r>
         <w:fldChar w:fldCharType="separate"/>
@@ -1723,7 +1723,7 @@
         <w:fldChar w:fldCharType="begin"/>
       </w:r>
       <w:r>
-        <w:instrText xml:space="preserve"> HYPERLINK \l _Toc14512 </w:instrText>
+        <w:instrText xml:space="preserve"> HYPERLINK \l _Toc14181 </w:instrText>
       </w:r>
       <w:r>
         <w:fldChar w:fldCharType="separate"/>
@@ -1750,7 +1750,7 @@
         <w:fldChar w:fldCharType="begin"/>
       </w:r>
       <w:r>
-        <w:instrText xml:space="preserve"> PAGEREF _Toc14512 \h </w:instrText>
+        <w:instrText xml:space="preserve"> PAGEREF _Toc14181 \h </w:instrText>
       </w:r>
       <w:r>
         <w:fldChar w:fldCharType="separate"/>
@@ -1776,7 +1776,7 @@
         <w:fldChar w:fldCharType="begin"/>
       </w:r>
       <w:r>
-        <w:instrText xml:space="preserve"> HYPERLINK \l _Toc772 </w:instrText>
+        <w:instrText xml:space="preserve"> HYPERLINK \l _Toc30 </w:instrText>
       </w:r>
       <w:r>
         <w:fldChar w:fldCharType="separate"/>
@@ -1798,7 +1798,7 @@
         <w:fldChar w:fldCharType="begin"/>
       </w:r>
       <w:r>
-        <w:instrText xml:space="preserve"> PAGEREF _Toc772 \h </w:instrText>
+        <w:instrText xml:space="preserve"> PAGEREF _Toc30 \h </w:instrText>
       </w:r>
       <w:r>
         <w:fldChar w:fldCharType="separate"/>
@@ -1824,7 +1824,7 @@
         <w:fldChar w:fldCharType="begin"/>
       </w:r>
       <w:r>
-        <w:instrText xml:space="preserve"> HYPERLINK \l _Toc10798 </w:instrText>
+        <w:instrText xml:space="preserve"> HYPERLINK \l _Toc26114 </w:instrText>
       </w:r>
       <w:r>
         <w:fldChar w:fldCharType="separate"/>
@@ -1846,7 +1846,7 @@
         <w:fldChar w:fldCharType="begin"/>
       </w:r>
       <w:r>
-        <w:instrText xml:space="preserve"> PAGEREF _Toc10798 \h </w:instrText>
+        <w:instrText xml:space="preserve"> PAGEREF _Toc26114 \h </w:instrText>
       </w:r>
       <w:r>
         <w:fldChar w:fldCharType="separate"/>
@@ -1872,7 +1872,7 @@
         <w:fldChar w:fldCharType="begin"/>
       </w:r>
       <w:r>
-        <w:instrText xml:space="preserve"> HYPERLINK \l _Toc24241 </w:instrText>
+        <w:instrText xml:space="preserve"> HYPERLINK \l _Toc30042 </w:instrText>
       </w:r>
       <w:r>
         <w:fldChar w:fldCharType="separate"/>
@@ -1894,7 +1894,7 @@
         <w:fldChar w:fldCharType="begin"/>
       </w:r>
       <w:r>
-        <w:instrText xml:space="preserve"> PAGEREF _Toc24241 \h </w:instrText>
+        <w:instrText xml:space="preserve"> PAGEREF _Toc30042 \h </w:instrText>
       </w:r>
       <w:r>
         <w:fldChar w:fldCharType="separate"/>
@@ -1920,7 +1920,7 @@
         <w:fldChar w:fldCharType="begin"/>
       </w:r>
       <w:r>
-        <w:instrText xml:space="preserve"> HYPERLINK \l _Toc19921 </w:instrText>
+        <w:instrText xml:space="preserve"> HYPERLINK \l _Toc16567 </w:instrText>
       </w:r>
       <w:r>
         <w:fldChar w:fldCharType="separate"/>
@@ -1942,7 +1942,7 @@
         <w:fldChar w:fldCharType="begin"/>
       </w:r>
       <w:r>
-        <w:instrText xml:space="preserve"> PAGEREF _Toc19921 \h </w:instrText>
+        <w:instrText xml:space="preserve"> PAGEREF _Toc16567 \h </w:instrText>
       </w:r>
       <w:r>
         <w:fldChar w:fldCharType="separate"/>
@@ -1968,7 +1968,7 @@
         <w:fldChar w:fldCharType="begin"/>
       </w:r>
       <w:r>
-        <w:instrText xml:space="preserve"> HYPERLINK \l _Toc31337 </w:instrText>
+        <w:instrText xml:space="preserve"> HYPERLINK \l _Toc32039 </w:instrText>
       </w:r>
       <w:r>
         <w:fldChar w:fldCharType="separate"/>
@@ -1990,7 +1990,7 @@
         <w:fldChar w:fldCharType="begin"/>
       </w:r>
       <w:r>
-        <w:instrText xml:space="preserve"> PAGEREF _Toc31337 \h </w:instrText>
+        <w:instrText xml:space="preserve"> PAGEREF _Toc32039 \h </w:instrText>
       </w:r>
       <w:r>
         <w:fldChar w:fldCharType="separate"/>
@@ -2016,7 +2016,7 @@
         <w:fldChar w:fldCharType="begin"/>
       </w:r>
       <w:r>
-        <w:instrText xml:space="preserve"> HYPERLINK \l _Toc26338 </w:instrText>
+        <w:instrText xml:space="preserve"> HYPERLINK \l _Toc3121 </w:instrText>
       </w:r>
       <w:r>
         <w:fldChar w:fldCharType="separate"/>
@@ -2038,7 +2038,7 @@
         <w:fldChar w:fldCharType="begin"/>
       </w:r>
       <w:r>
-        <w:instrText xml:space="preserve"> PAGEREF _Toc26338 \h </w:instrText>
+        <w:instrText xml:space="preserve"> PAGEREF _Toc3121 \h </w:instrText>
       </w:r>
       <w:r>
         <w:fldChar w:fldCharType="separate"/>
@@ -2064,7 +2064,7 @@
         <w:fldChar w:fldCharType="begin"/>
       </w:r>
       <w:r>
-        <w:instrText xml:space="preserve"> HYPERLINK \l _Toc27172 </w:instrText>
+        <w:instrText xml:space="preserve"> HYPERLINK \l _Toc29234 </w:instrText>
       </w:r>
       <w:r>
         <w:fldChar w:fldCharType="separate"/>
@@ -2091,7 +2091,7 @@
         <w:fldChar w:fldCharType="begin"/>
       </w:r>
       <w:r>
-        <w:instrText xml:space="preserve"> PAGEREF _Toc27172 \h </w:instrText>
+        <w:instrText xml:space="preserve"> PAGEREF _Toc29234 \h </w:instrText>
       </w:r>
       <w:r>
         <w:fldChar w:fldCharType="separate"/>
@@ -2117,7 +2117,7 @@
         <w:fldChar w:fldCharType="begin"/>
       </w:r>
       <w:r>
-        <w:instrText xml:space="preserve"> HYPERLINK \l _Toc26633 </w:instrText>
+        <w:instrText xml:space="preserve"> HYPERLINK \l _Toc9788 </w:instrText>
       </w:r>
       <w:r>
         <w:fldChar w:fldCharType="separate"/>
@@ -2147,7 +2147,7 @@
         <w:fldChar w:fldCharType="begin"/>
       </w:r>
       <w:r>
-        <w:instrText xml:space="preserve"> PAGEREF _Toc26633 \h </w:instrText>
+        <w:instrText xml:space="preserve"> PAGEREF _Toc9788 \h </w:instrText>
       </w:r>
       <w:r>
         <w:fldChar w:fldCharType="separate"/>
@@ -2173,7 +2173,7 @@
         <w:fldChar w:fldCharType="begin"/>
       </w:r>
       <w:r>
-        <w:instrText xml:space="preserve"> HYPERLINK \l _Toc29259 </w:instrText>
+        <w:instrText xml:space="preserve"> HYPERLINK \l _Toc14760 </w:instrText>
       </w:r>
       <w:r>
         <w:fldChar w:fldCharType="separate"/>
@@ -2195,7 +2195,7 @@
         <w:fldChar w:fldCharType="begin"/>
       </w:r>
       <w:r>
-        <w:instrText xml:space="preserve"> PAGEREF _Toc29259 \h </w:instrText>
+        <w:instrText xml:space="preserve"> PAGEREF _Toc14760 \h </w:instrText>
       </w:r>
       <w:r>
         <w:fldChar w:fldCharType="separate"/>
@@ -2221,7 +2221,7 @@
         <w:fldChar w:fldCharType="begin"/>
       </w:r>
       <w:r>
-        <w:instrText xml:space="preserve"> HYPERLINK \l _Toc14047 </w:instrText>
+        <w:instrText xml:space="preserve"> HYPERLINK \l _Toc2998 </w:instrText>
       </w:r>
       <w:r>
         <w:fldChar w:fldCharType="separate"/>
@@ -2243,7 +2243,7 @@
         <w:fldChar w:fldCharType="begin"/>
       </w:r>
       <w:r>
-        <w:instrText xml:space="preserve"> PAGEREF _Toc14047 \h </w:instrText>
+        <w:instrText xml:space="preserve"> PAGEREF _Toc2998 \h </w:instrText>
       </w:r>
       <w:r>
         <w:fldChar w:fldCharType="separate"/>
@@ -2269,7 +2269,7 @@
         <w:fldChar w:fldCharType="begin"/>
       </w:r>
       <w:r>
-        <w:instrText xml:space="preserve"> HYPERLINK \l _Toc12678 </w:instrText>
+        <w:instrText xml:space="preserve"> HYPERLINK \l _Toc24518 </w:instrText>
       </w:r>
       <w:r>
         <w:fldChar w:fldCharType="separate"/>
@@ -2291,7 +2291,7 @@
         <w:fldChar w:fldCharType="begin"/>
       </w:r>
       <w:r>
-        <w:instrText xml:space="preserve"> PAGEREF _Toc12678 \h </w:instrText>
+        <w:instrText xml:space="preserve"> PAGEREF _Toc24518 \h </w:instrText>
       </w:r>
       <w:r>
         <w:fldChar w:fldCharType="separate"/>
@@ -2317,7 +2317,7 @@
         <w:fldChar w:fldCharType="begin"/>
       </w:r>
       <w:r>
-        <w:instrText xml:space="preserve"> HYPERLINK \l _Toc20763 </w:instrText>
+        <w:instrText xml:space="preserve"> HYPERLINK \l _Toc30554 </w:instrText>
       </w:r>
       <w:r>
         <w:fldChar w:fldCharType="separate"/>
@@ -2330,7 +2330,7 @@
         <w:t xml:space="preserve">2.5. </w:t>
       </w:r>
       <w:r>
-        <w:t>NodeJS và ExpressJS</w:t>
+        <w:t>NodeJS</w:t>
       </w:r>
       <w:r>
         <w:tab/>
@@ -2339,13 +2339,13 @@
         <w:fldChar w:fldCharType="begin"/>
       </w:r>
       <w:r>
-        <w:instrText xml:space="preserve"> PAGEREF _Toc20763 \h </w:instrText>
+        <w:instrText xml:space="preserve"> PAGEREF _Toc30554 \h </w:instrText>
       </w:r>
       <w:r>
         <w:fldChar w:fldCharType="separate"/>
       </w:r>
       <w:r>
-        <w:t>27</w:t>
+        <w:t>26</w:t>
       </w:r>
       <w:r>
         <w:fldChar w:fldCharType="end"/>
@@ -2356,7 +2356,7 @@
     </w:p>
     <w:p>
       <w:pPr>
-        <w:pStyle w:val="28"/>
+        <w:pStyle w:val="29"/>
         <w:tabs>
           <w:tab w:val="right" w:leader="dot" w:pos="9072"/>
         </w:tabs>
@@ -2365,7 +2365,7 @@
         <w:fldChar w:fldCharType="begin"/>
       </w:r>
       <w:r>
-        <w:instrText xml:space="preserve"> HYPERLINK \l _Toc18865 </w:instrText>
+        <w:instrText xml:space="preserve"> HYPERLINK \l _Toc24070 </w:instrText>
       </w:r>
       <w:r>
         <w:fldChar w:fldCharType="separate"/>
@@ -2375,10 +2375,14 @@
           <w:rFonts w:hint="default" w:ascii="Times New Roman" w:hAnsi="Times New Roman"/>
           <w:i w:val="0"/>
         </w:rPr>
-        <w:t xml:space="preserve">2.6. </w:t>
-      </w:r>
-      <w:r>
-        <w:t>Python</w:t>
+        <w:t xml:space="preserve">2.5.1. </w:t>
+      </w:r>
+      <w:r>
+        <w:rPr>
+          <w:rFonts w:hint="default"/>
+          <w:lang w:val="vi-VN"/>
+        </w:rPr>
+        <w:t>Khái niệm về NodeJS</w:t>
       </w:r>
       <w:r>
         <w:tab/>
@@ -2387,13 +2391,13 @@
         <w:fldChar w:fldCharType="begin"/>
       </w:r>
       <w:r>
-        <w:instrText xml:space="preserve"> PAGEREF _Toc18865 \h </w:instrText>
+        <w:instrText xml:space="preserve"> PAGEREF _Toc24070 \h </w:instrText>
       </w:r>
       <w:r>
         <w:fldChar w:fldCharType="separate"/>
       </w:r>
       <w:r>
-        <w:t>27</w:t>
+        <w:t>26</w:t>
       </w:r>
       <w:r>
         <w:fldChar w:fldCharType="end"/>
@@ -2404,7 +2408,7 @@
     </w:p>
     <w:p>
       <w:pPr>
-        <w:pStyle w:val="28"/>
+        <w:pStyle w:val="29"/>
         <w:tabs>
           <w:tab w:val="right" w:leader="dot" w:pos="9072"/>
         </w:tabs>
@@ -2413,7 +2417,7 @@
         <w:fldChar w:fldCharType="begin"/>
       </w:r>
       <w:r>
-        <w:instrText xml:space="preserve"> HYPERLINK \l _Toc2078 </w:instrText>
+        <w:instrText xml:space="preserve"> HYPERLINK \l _Toc10169 </w:instrText>
       </w:r>
       <w:r>
         <w:fldChar w:fldCharType="separate"/>
@@ -2423,10 +2427,10 @@
           <w:rFonts w:hint="default" w:ascii="Times New Roman" w:hAnsi="Times New Roman"/>
           <w:i w:val="0"/>
         </w:rPr>
-        <w:t xml:space="preserve">2.7. </w:t>
-      </w:r>
-      <w:r>
-        <w:t>Thuật toán SVD</w:t>
+        <w:t xml:space="preserve">2.5.2. </w:t>
+      </w:r>
+      <w:r>
+        <w:t>Đặc điểm chính</w:t>
       </w:r>
       <w:r>
         <w:tab/>
@@ -2435,7 +2439,7 @@
         <w:fldChar w:fldCharType="begin"/>
       </w:r>
       <w:r>
-        <w:instrText xml:space="preserve"> PAGEREF _Toc2078 \h </w:instrText>
+        <w:instrText xml:space="preserve"> PAGEREF _Toc10169 \h </w:instrText>
       </w:r>
       <w:r>
         <w:fldChar w:fldCharType="separate"/>
@@ -2452,7 +2456,7 @@
     </w:p>
     <w:p>
       <w:pPr>
-        <w:pStyle w:val="28"/>
+        <w:pStyle w:val="29"/>
         <w:tabs>
           <w:tab w:val="right" w:leader="dot" w:pos="9072"/>
         </w:tabs>
@@ -2461,7 +2465,7 @@
         <w:fldChar w:fldCharType="begin"/>
       </w:r>
       <w:r>
-        <w:instrText xml:space="preserve"> HYPERLINK \l _Toc2490 </w:instrText>
+        <w:instrText xml:space="preserve"> HYPERLINK \l _Toc32686 </w:instrText>
       </w:r>
       <w:r>
         <w:fldChar w:fldCharType="separate"/>
@@ -2471,10 +2475,10 @@
           <w:rFonts w:hint="default" w:ascii="Times New Roman" w:hAnsi="Times New Roman"/>
           <w:i w:val="0"/>
         </w:rPr>
-        <w:t xml:space="preserve">2.8. </w:t>
-      </w:r>
-      <w:r>
-        <w:t>RESTful API và GraphQL</w:t>
+        <w:t xml:space="preserve">2.5.3. </w:t>
+      </w:r>
+      <w:r>
+        <w:t>Hạn chế</w:t>
       </w:r>
       <w:r>
         <w:tab/>
@@ -2483,7 +2487,7 @@
         <w:fldChar w:fldCharType="begin"/>
       </w:r>
       <w:r>
-        <w:instrText xml:space="preserve"> PAGEREF _Toc2490 \h </w:instrText>
+        <w:instrText xml:space="preserve"> PAGEREF _Toc32686 \h </w:instrText>
       </w:r>
       <w:r>
         <w:fldChar w:fldCharType="separate"/>
@@ -2500,7 +2504,7 @@
     </w:p>
     <w:p>
       <w:pPr>
-        <w:pStyle w:val="28"/>
+        <w:pStyle w:val="29"/>
         <w:tabs>
           <w:tab w:val="right" w:leader="dot" w:pos="9072"/>
         </w:tabs>
@@ -2509,7 +2513,7 @@
         <w:fldChar w:fldCharType="begin"/>
       </w:r>
       <w:r>
-        <w:instrText xml:space="preserve"> HYPERLINK \l _Toc28140 </w:instrText>
+        <w:instrText xml:space="preserve"> HYPERLINK \l _Toc3604 </w:instrText>
       </w:r>
       <w:r>
         <w:fldChar w:fldCharType="separate"/>
@@ -2518,11 +2522,16 @@
         <w:rPr>
           <w:rFonts w:hint="default" w:ascii="Times New Roman" w:hAnsi="Times New Roman"/>
           <w:i w:val="0"/>
-        </w:rPr>
-        <w:t xml:space="preserve">2.9. </w:t>
-      </w:r>
-      <w:r>
-        <w:t>Thương mại điện tử</w:t>
+          <w:lang w:val="vi-VN"/>
+        </w:rPr>
+        <w:t xml:space="preserve">2.5.4. </w:t>
+      </w:r>
+      <w:r>
+        <w:rPr>
+          <w:rFonts w:hint="default"/>
+          <w:lang w:val="vi-VN"/>
+        </w:rPr>
+        <w:t>So sánh giữa Node.js và Spring Boot</w:t>
       </w:r>
       <w:r>
         <w:tab/>
@@ -2531,13 +2540,13 @@
         <w:fldChar w:fldCharType="begin"/>
       </w:r>
       <w:r>
-        <w:instrText xml:space="preserve"> PAGEREF _Toc28140 \h </w:instrText>
+        <w:instrText xml:space="preserve"> PAGEREF _Toc3604 \h </w:instrText>
       </w:r>
       <w:r>
         <w:fldChar w:fldCharType="separate"/>
       </w:r>
       <w:r>
-        <w:t>27</w:t>
+        <w:t>28</w:t>
       </w:r>
       <w:r>
         <w:fldChar w:fldCharType="end"/>
@@ -2557,7 +2566,7 @@
         <w:fldChar w:fldCharType="begin"/>
       </w:r>
       <w:r>
-        <w:instrText xml:space="preserve"> HYPERLINK \l _Toc26427 </w:instrText>
+        <w:instrText xml:space="preserve"> HYPERLINK \l _Toc16324 </w:instrText>
       </w:r>
       <w:r>
         <w:fldChar w:fldCharType="separate"/>
@@ -2567,10 +2576,10 @@
           <w:rFonts w:hint="default" w:ascii="Times New Roman" w:hAnsi="Times New Roman"/>
           <w:i w:val="0"/>
         </w:rPr>
-        <w:t xml:space="preserve">2.10. </w:t>
-      </w:r>
-      <w:r>
-        <w:t>Thuật toán gợi ý</w:t>
+        <w:t xml:space="preserve">2.6. </w:t>
+      </w:r>
+      <w:r>
+        <w:t>Python</w:t>
       </w:r>
       <w:r>
         <w:tab/>
@@ -2579,13 +2588,13 @@
         <w:fldChar w:fldCharType="begin"/>
       </w:r>
       <w:r>
-        <w:instrText xml:space="preserve"> PAGEREF _Toc26427 \h </w:instrText>
+        <w:instrText xml:space="preserve"> PAGEREF _Toc16324 \h </w:instrText>
       </w:r>
       <w:r>
         <w:fldChar w:fldCharType="separate"/>
       </w:r>
       <w:r>
-        <w:t>27</w:t>
+        <w:t>29</w:t>
       </w:r>
       <w:r>
         <w:fldChar w:fldCharType="end"/>
@@ -2596,7 +2605,7 @@
     </w:p>
     <w:p>
       <w:pPr>
-        <w:pStyle w:val="28"/>
+        <w:pStyle w:val="29"/>
         <w:tabs>
           <w:tab w:val="right" w:leader="dot" w:pos="9072"/>
         </w:tabs>
@@ -2605,7 +2614,7 @@
         <w:fldChar w:fldCharType="begin"/>
       </w:r>
       <w:r>
-        <w:instrText xml:space="preserve"> HYPERLINK \l _Toc9934 </w:instrText>
+        <w:instrText xml:space="preserve"> HYPERLINK \l _Toc29946 </w:instrText>
       </w:r>
       <w:r>
         <w:fldChar w:fldCharType="separate"/>
@@ -2614,11 +2623,16 @@
         <w:rPr>
           <w:rFonts w:hint="default" w:ascii="Times New Roman" w:hAnsi="Times New Roman"/>
           <w:i w:val="0"/>
-        </w:rPr>
-        <w:t xml:space="preserve">2.11. </w:t>
-      </w:r>
-      <w:r>
-        <w:t>NLP</w:t>
+          <w:lang w:val="vi-VN"/>
+        </w:rPr>
+        <w:t xml:space="preserve">2.6.1. </w:t>
+      </w:r>
+      <w:r>
+        <w:rPr>
+          <w:rFonts w:hint="default"/>
+          <w:lang w:val="vi-VN"/>
+        </w:rPr>
+        <w:t>Khái niệm về ngôn ngữ Python</w:t>
       </w:r>
       <w:r>
         <w:tab/>
@@ -2627,13 +2641,13 @@
         <w:fldChar w:fldCharType="begin"/>
       </w:r>
       <w:r>
-        <w:instrText xml:space="preserve"> PAGEREF _Toc9934 \h </w:instrText>
+        <w:instrText xml:space="preserve"> PAGEREF _Toc29946 \h </w:instrText>
       </w:r>
       <w:r>
         <w:fldChar w:fldCharType="separate"/>
       </w:r>
       <w:r>
-        <w:t>27</w:t>
+        <w:t>29</w:t>
       </w:r>
       <w:r>
         <w:fldChar w:fldCharType="end"/>
@@ -2644,7 +2658,7 @@
     </w:p>
     <w:p>
       <w:pPr>
-        <w:pStyle w:val="28"/>
+        <w:pStyle w:val="29"/>
         <w:tabs>
           <w:tab w:val="right" w:leader="dot" w:pos="9072"/>
         </w:tabs>
@@ -2653,7 +2667,7 @@
         <w:fldChar w:fldCharType="begin"/>
       </w:r>
       <w:r>
-        <w:instrText xml:space="preserve"> HYPERLINK \l _Toc19974 </w:instrText>
+        <w:instrText xml:space="preserve"> HYPERLINK \l _Toc5047 </w:instrText>
       </w:r>
       <w:r>
         <w:fldChar w:fldCharType="separate"/>
@@ -2662,11 +2676,16 @@
         <w:rPr>
           <w:rFonts w:hint="default" w:ascii="Times New Roman" w:hAnsi="Times New Roman"/>
           <w:i w:val="0"/>
-        </w:rPr>
-        <w:t xml:space="preserve">2.12. </w:t>
-      </w:r>
-      <w:r>
-        <w:t>Generative AI</w:t>
+          <w:lang w:val="vi-VN"/>
+        </w:rPr>
+        <w:t xml:space="preserve">2.6.2. </w:t>
+      </w:r>
+      <w:r>
+        <w:rPr>
+          <w:rFonts w:hint="default"/>
+          <w:lang w:val="vi-VN"/>
+        </w:rPr>
+        <w:t>Ứng dụng Python trong dự án</w:t>
       </w:r>
       <w:r>
         <w:tab/>
@@ -2675,13 +2694,13 @@
         <w:fldChar w:fldCharType="begin"/>
       </w:r>
       <w:r>
-        <w:instrText xml:space="preserve"> PAGEREF _Toc19974 \h </w:instrText>
+        <w:instrText xml:space="preserve"> PAGEREF _Toc5047 \h </w:instrText>
       </w:r>
       <w:r>
         <w:fldChar w:fldCharType="separate"/>
       </w:r>
       <w:r>
-        <w:t>27</w:t>
+        <w:t>30</w:t>
       </w:r>
       <w:r>
         <w:fldChar w:fldCharType="end"/>
@@ -2701,7 +2720,7 @@
         <w:fldChar w:fldCharType="begin"/>
       </w:r>
       <w:r>
-        <w:instrText xml:space="preserve"> HYPERLINK \l _Toc11575 </w:instrText>
+        <w:instrText xml:space="preserve"> HYPERLINK \l _Toc25809 </w:instrText>
       </w:r>
       <w:r>
         <w:fldChar w:fldCharType="separate"/>
@@ -2711,10 +2730,10 @@
           <w:rFonts w:hint="default" w:ascii="Times New Roman" w:hAnsi="Times New Roman"/>
           <w:i w:val="0"/>
         </w:rPr>
-        <w:t xml:space="preserve">2.13. </w:t>
-      </w:r>
-      <w:r>
-        <w:t>Bảo mật</w:t>
+        <w:t xml:space="preserve">2.7. </w:t>
+      </w:r>
+      <w:r>
+        <w:t>Thuật toán SVD</w:t>
       </w:r>
       <w:r>
         <w:tab/>
@@ -2723,13 +2742,13 @@
         <w:fldChar w:fldCharType="begin"/>
       </w:r>
       <w:r>
-        <w:instrText xml:space="preserve"> PAGEREF _Toc11575 \h </w:instrText>
+        <w:instrText xml:space="preserve"> PAGEREF _Toc25809 \h </w:instrText>
       </w:r>
       <w:r>
         <w:fldChar w:fldCharType="separate"/>
       </w:r>
       <w:r>
-        <w:t>27</w:t>
+        <w:t>31</w:t>
       </w:r>
       <w:r>
         <w:fldChar w:fldCharType="end"/>
@@ -2749,7 +2768,7 @@
         <w:fldChar w:fldCharType="begin"/>
       </w:r>
       <w:r>
-        <w:instrText xml:space="preserve"> HYPERLINK \l _Toc15623 </w:instrText>
+        <w:instrText xml:space="preserve"> HYPERLINK \l _Toc28735 </w:instrText>
       </w:r>
       <w:r>
         <w:fldChar w:fldCharType="separate"/>
@@ -2758,11 +2777,16 @@
         <w:rPr>
           <w:rFonts w:hint="default" w:ascii="Times New Roman" w:hAnsi="Times New Roman"/>
           <w:i w:val="0"/>
-        </w:rPr>
-        <w:t xml:space="preserve">2.14. </w:t>
-      </w:r>
-      <w:r>
-        <w:t>MySQL</w:t>
+          <w:lang w:val="vi-VN"/>
+        </w:rPr>
+        <w:t xml:space="preserve">2.8. </w:t>
+      </w:r>
+      <w:r>
+        <w:rPr>
+          <w:rFonts w:hint="default"/>
+          <w:lang w:val="vi-VN"/>
+        </w:rPr>
+        <w:t>Ứng dụng RAG trong dự án</w:t>
       </w:r>
       <w:r>
         <w:tab/>
@@ -2771,13 +2795,13 @@
         <w:fldChar w:fldCharType="begin"/>
       </w:r>
       <w:r>
-        <w:instrText xml:space="preserve"> PAGEREF _Toc15623 \h </w:instrText>
+        <w:instrText xml:space="preserve"> PAGEREF _Toc28735 \h </w:instrText>
       </w:r>
       <w:r>
         <w:fldChar w:fldCharType="separate"/>
       </w:r>
       <w:r>
-        <w:t>27</w:t>
+        <w:t>31</w:t>
       </w:r>
       <w:r>
         <w:fldChar w:fldCharType="end"/>
@@ -2797,7 +2821,7 @@
         <w:fldChar w:fldCharType="begin"/>
       </w:r>
       <w:r>
-        <w:instrText xml:space="preserve"> HYPERLINK \l _Toc16803 </w:instrText>
+        <w:instrText xml:space="preserve"> HYPERLINK \l _Toc32183 </w:instrText>
       </w:r>
       <w:r>
         <w:fldChar w:fldCharType="separate"/>
@@ -2807,10 +2831,10 @@
           <w:rFonts w:hint="default" w:ascii="Times New Roman" w:hAnsi="Times New Roman"/>
           <w:i w:val="0"/>
         </w:rPr>
-        <w:t xml:space="preserve">2.15. </w:t>
-      </w:r>
-      <w:r>
-        <w:t>API thanh toán MoMo</w:t>
+        <w:t xml:space="preserve">2.9. </w:t>
+      </w:r>
+      <w:r>
+        <w:t>RESTful API và GraphQL</w:t>
       </w:r>
       <w:r>
         <w:tab/>
@@ -2819,13 +2843,13 @@
         <w:fldChar w:fldCharType="begin"/>
       </w:r>
       <w:r>
-        <w:instrText xml:space="preserve"> PAGEREF _Toc16803 \h </w:instrText>
+        <w:instrText xml:space="preserve"> PAGEREF _Toc32183 \h </w:instrText>
       </w:r>
       <w:r>
         <w:fldChar w:fldCharType="separate"/>
       </w:r>
       <w:r>
-        <w:t>27</w:t>
+        <w:t>31</w:t>
       </w:r>
       <w:r>
         <w:fldChar w:fldCharType="end"/>
@@ -2845,7 +2869,7 @@
         <w:fldChar w:fldCharType="begin"/>
       </w:r>
       <w:r>
-        <w:instrText xml:space="preserve"> HYPERLINK \l _Toc8986 </w:instrText>
+        <w:instrText xml:space="preserve"> HYPERLINK \l _Toc569 </w:instrText>
       </w:r>
       <w:r>
         <w:fldChar w:fldCharType="separate"/>
@@ -2855,10 +2879,10 @@
           <w:rFonts w:hint="default" w:ascii="Times New Roman" w:hAnsi="Times New Roman"/>
           <w:i w:val="0"/>
         </w:rPr>
-        <w:t xml:space="preserve">2.16. </w:t>
-      </w:r>
-      <w:r>
-        <w:t>Nghiệp vụ hệ thống</w:t>
+        <w:t xml:space="preserve">2.10. </w:t>
+      </w:r>
+      <w:r>
+        <w:t>Thương mại điện tử</w:t>
       </w:r>
       <w:r>
         <w:tab/>
@@ -2867,13 +2891,13 @@
         <w:fldChar w:fldCharType="begin"/>
       </w:r>
       <w:r>
-        <w:instrText xml:space="preserve"> PAGEREF _Toc8986 \h </w:instrText>
+        <w:instrText xml:space="preserve"> PAGEREF _Toc569 \h </w:instrText>
       </w:r>
       <w:r>
         <w:fldChar w:fldCharType="separate"/>
       </w:r>
       <w:r>
-        <w:t>27</w:t>
+        <w:t>31</w:t>
       </w:r>
       <w:r>
         <w:fldChar w:fldCharType="end"/>
@@ -2893,7 +2917,7 @@
         <w:fldChar w:fldCharType="begin"/>
       </w:r>
       <w:r>
-        <w:instrText xml:space="preserve"> HYPERLINK \l _Toc20097 </w:instrText>
+        <w:instrText xml:space="preserve"> HYPERLINK \l _Toc31071 </w:instrText>
       </w:r>
       <w:r>
         <w:fldChar w:fldCharType="separate"/>
@@ -2903,9 +2927,345 @@
           <w:rFonts w:hint="default" w:ascii="Times New Roman" w:hAnsi="Times New Roman"/>
           <w:i w:val="0"/>
         </w:rPr>
+        <w:t xml:space="preserve">2.11. </w:t>
+      </w:r>
+      <w:r>
+        <w:t>Thuật toán gợi ý</w:t>
+      </w:r>
+      <w:r>
+        <w:tab/>
+      </w:r>
+      <w:r>
+        <w:fldChar w:fldCharType="begin"/>
+      </w:r>
+      <w:r>
+        <w:instrText xml:space="preserve"> PAGEREF _Toc31071 \h </w:instrText>
+      </w:r>
+      <w:r>
+        <w:fldChar w:fldCharType="separate"/>
+      </w:r>
+      <w:r>
+        <w:t>31</w:t>
+      </w:r>
+      <w:r>
+        <w:fldChar w:fldCharType="end"/>
+      </w:r>
+      <w:r>
+        <w:fldChar w:fldCharType="end"/>
+      </w:r>
+    </w:p>
+    <w:p>
+      <w:pPr>
+        <w:pStyle w:val="28"/>
+        <w:tabs>
+          <w:tab w:val="right" w:leader="dot" w:pos="9072"/>
+        </w:tabs>
+      </w:pPr>
+      <w:r>
+        <w:fldChar w:fldCharType="begin"/>
+      </w:r>
+      <w:r>
+        <w:instrText xml:space="preserve"> HYPERLINK \l _Toc9115 </w:instrText>
+      </w:r>
+      <w:r>
+        <w:fldChar w:fldCharType="separate"/>
+      </w:r>
+      <w:r>
+        <w:rPr>
+          <w:rFonts w:hint="default" w:ascii="Times New Roman" w:hAnsi="Times New Roman"/>
+          <w:i w:val="0"/>
+        </w:rPr>
+        <w:t xml:space="preserve">2.12. </w:t>
+      </w:r>
+      <w:r>
+        <w:t>NLP</w:t>
+      </w:r>
+      <w:r>
+        <w:tab/>
+      </w:r>
+      <w:r>
+        <w:fldChar w:fldCharType="begin"/>
+      </w:r>
+      <w:r>
+        <w:instrText xml:space="preserve"> PAGEREF _Toc9115 \h </w:instrText>
+      </w:r>
+      <w:r>
+        <w:fldChar w:fldCharType="separate"/>
+      </w:r>
+      <w:r>
+        <w:t>31</w:t>
+      </w:r>
+      <w:r>
+        <w:fldChar w:fldCharType="end"/>
+      </w:r>
+      <w:r>
+        <w:fldChar w:fldCharType="end"/>
+      </w:r>
+    </w:p>
+    <w:p>
+      <w:pPr>
+        <w:pStyle w:val="28"/>
+        <w:tabs>
+          <w:tab w:val="right" w:leader="dot" w:pos="9072"/>
+        </w:tabs>
+      </w:pPr>
+      <w:r>
+        <w:fldChar w:fldCharType="begin"/>
+      </w:r>
+      <w:r>
+        <w:instrText xml:space="preserve"> HYPERLINK \l _Toc23760 </w:instrText>
+      </w:r>
+      <w:r>
+        <w:fldChar w:fldCharType="separate"/>
+      </w:r>
+      <w:r>
+        <w:rPr>
+          <w:rFonts w:hint="default" w:ascii="Times New Roman" w:hAnsi="Times New Roman"/>
+          <w:i w:val="0"/>
+        </w:rPr>
+        <w:t xml:space="preserve">2.13. </w:t>
+      </w:r>
+      <w:r>
+        <w:t>Generative AI</w:t>
+      </w:r>
+      <w:r>
+        <w:tab/>
+      </w:r>
+      <w:r>
+        <w:fldChar w:fldCharType="begin"/>
+      </w:r>
+      <w:r>
+        <w:instrText xml:space="preserve"> PAGEREF _Toc23760 \h </w:instrText>
+      </w:r>
+      <w:r>
+        <w:fldChar w:fldCharType="separate"/>
+      </w:r>
+      <w:r>
+        <w:t>31</w:t>
+      </w:r>
+      <w:r>
+        <w:fldChar w:fldCharType="end"/>
+      </w:r>
+      <w:r>
+        <w:fldChar w:fldCharType="end"/>
+      </w:r>
+    </w:p>
+    <w:p>
+      <w:pPr>
+        <w:pStyle w:val="28"/>
+        <w:tabs>
+          <w:tab w:val="right" w:leader="dot" w:pos="9072"/>
+        </w:tabs>
+      </w:pPr>
+      <w:r>
+        <w:fldChar w:fldCharType="begin"/>
+      </w:r>
+      <w:r>
+        <w:instrText xml:space="preserve"> HYPERLINK \l _Toc5285 </w:instrText>
+      </w:r>
+      <w:r>
+        <w:fldChar w:fldCharType="separate"/>
+      </w:r>
+      <w:r>
+        <w:rPr>
+          <w:rFonts w:hint="default" w:ascii="Times New Roman" w:hAnsi="Times New Roman"/>
+          <w:i w:val="0"/>
+        </w:rPr>
+        <w:t xml:space="preserve">2.14. </w:t>
+      </w:r>
+      <w:r>
+        <w:t>Bảo mật</w:t>
+      </w:r>
+      <w:r>
+        <w:tab/>
+      </w:r>
+      <w:r>
+        <w:fldChar w:fldCharType="begin"/>
+      </w:r>
+      <w:r>
+        <w:instrText xml:space="preserve"> PAGEREF _Toc5285 \h </w:instrText>
+      </w:r>
+      <w:r>
+        <w:fldChar w:fldCharType="separate"/>
+      </w:r>
+      <w:r>
+        <w:t>31</w:t>
+      </w:r>
+      <w:r>
+        <w:fldChar w:fldCharType="end"/>
+      </w:r>
+      <w:r>
+        <w:fldChar w:fldCharType="end"/>
+      </w:r>
+    </w:p>
+    <w:p>
+      <w:pPr>
+        <w:pStyle w:val="28"/>
+        <w:tabs>
+          <w:tab w:val="right" w:leader="dot" w:pos="9072"/>
+        </w:tabs>
+      </w:pPr>
+      <w:r>
+        <w:fldChar w:fldCharType="begin"/>
+      </w:r>
+      <w:r>
+        <w:instrText xml:space="preserve"> HYPERLINK \l _Toc24887 </w:instrText>
+      </w:r>
+      <w:r>
+        <w:fldChar w:fldCharType="separate"/>
+      </w:r>
+      <w:r>
+        <w:rPr>
+          <w:rFonts w:hint="default" w:ascii="Times New Roman" w:hAnsi="Times New Roman"/>
+          <w:i w:val="0"/>
+        </w:rPr>
+        <w:t xml:space="preserve">2.15. </w:t>
+      </w:r>
+      <w:r>
+        <w:t>MySQL</w:t>
+      </w:r>
+      <w:r>
+        <w:tab/>
+      </w:r>
+      <w:r>
+        <w:fldChar w:fldCharType="begin"/>
+      </w:r>
+      <w:r>
+        <w:instrText xml:space="preserve"> PAGEREF _Toc24887 \h </w:instrText>
+      </w:r>
+      <w:r>
+        <w:fldChar w:fldCharType="separate"/>
+      </w:r>
+      <w:r>
+        <w:t>31</w:t>
+      </w:r>
+      <w:r>
+        <w:fldChar w:fldCharType="end"/>
+      </w:r>
+      <w:r>
+        <w:fldChar w:fldCharType="end"/>
+      </w:r>
+    </w:p>
+    <w:p>
+      <w:pPr>
+        <w:pStyle w:val="28"/>
+        <w:tabs>
+          <w:tab w:val="right" w:leader="dot" w:pos="9072"/>
+        </w:tabs>
+      </w:pPr>
+      <w:r>
+        <w:fldChar w:fldCharType="begin"/>
+      </w:r>
+      <w:r>
+        <w:instrText xml:space="preserve"> HYPERLINK \l _Toc1021 </w:instrText>
+      </w:r>
+      <w:r>
+        <w:fldChar w:fldCharType="separate"/>
+      </w:r>
+      <w:r>
+        <w:rPr>
+          <w:rFonts w:hint="default" w:ascii="Times New Roman" w:hAnsi="Times New Roman"/>
+          <w:i w:val="0"/>
+        </w:rPr>
+        <w:t xml:space="preserve">2.16. </w:t>
+      </w:r>
+      <w:r>
+        <w:t>API thanh toán MoMo</w:t>
+      </w:r>
+      <w:r>
+        <w:tab/>
+      </w:r>
+      <w:r>
+        <w:fldChar w:fldCharType="begin"/>
+      </w:r>
+      <w:r>
+        <w:instrText xml:space="preserve"> PAGEREF _Toc1021 \h </w:instrText>
+      </w:r>
+      <w:r>
+        <w:fldChar w:fldCharType="separate"/>
+      </w:r>
+      <w:r>
+        <w:t>31</w:t>
+      </w:r>
+      <w:r>
+        <w:fldChar w:fldCharType="end"/>
+      </w:r>
+      <w:r>
+        <w:fldChar w:fldCharType="end"/>
+      </w:r>
+    </w:p>
+    <w:p>
+      <w:pPr>
+        <w:pStyle w:val="28"/>
+        <w:tabs>
+          <w:tab w:val="right" w:leader="dot" w:pos="9072"/>
+        </w:tabs>
+      </w:pPr>
+      <w:r>
+        <w:fldChar w:fldCharType="begin"/>
+      </w:r>
+      <w:r>
+        <w:instrText xml:space="preserve"> HYPERLINK \l _Toc5161 </w:instrText>
+      </w:r>
+      <w:r>
+        <w:fldChar w:fldCharType="separate"/>
+      </w:r>
+      <w:r>
+        <w:rPr>
+          <w:rFonts w:hint="default" w:ascii="Times New Roman" w:hAnsi="Times New Roman"/>
+          <w:i w:val="0"/>
+        </w:rPr>
         <w:t xml:space="preserve">2.17. </w:t>
       </w:r>
       <w:r>
+        <w:t>Nghiệp vụ hệ thống</w:t>
+      </w:r>
+      <w:r>
+        <w:tab/>
+      </w:r>
+      <w:r>
+        <w:fldChar w:fldCharType="begin"/>
+      </w:r>
+      <w:r>
+        <w:instrText xml:space="preserve"> PAGEREF _Toc5161 \h </w:instrText>
+      </w:r>
+      <w:r>
+        <w:fldChar w:fldCharType="separate"/>
+      </w:r>
+      <w:r>
+        <w:t>31</w:t>
+      </w:r>
+      <w:r>
+        <w:fldChar w:fldCharType="end"/>
+      </w:r>
+      <w:r>
+        <w:fldChar w:fldCharType="end"/>
+      </w:r>
+    </w:p>
+    <w:p>
+      <w:pPr>
+        <w:pStyle w:val="28"/>
+        <w:tabs>
+          <w:tab w:val="right" w:leader="dot" w:pos="9072"/>
+        </w:tabs>
+      </w:pPr>
+      <w:r>
+        <w:fldChar w:fldCharType="begin"/>
+      </w:r>
+      <w:r>
+        <w:instrText xml:space="preserve"> HYPERLINK \l _Toc1118 </w:instrText>
+      </w:r>
+      <w:r>
+        <w:fldChar w:fldCharType="separate"/>
+      </w:r>
+      <w:r>
+        <w:rPr>
+          <w:rFonts w:hint="default" w:ascii="Times New Roman" w:hAnsi="Times New Roman"/>
+          <w:i w:val="0"/>
+        </w:rPr>
+        <w:t xml:space="preserve">2.18. </w:t>
+      </w:r>
+      <w:r>
         <w:rPr>
           <w:rFonts w:hint="default"/>
           <w:lang w:val="vi-VN"/>
@@ -2919,13 +3279,13 @@
         <w:fldChar w:fldCharType="begin"/>
       </w:r>
       <w:r>
-        <w:instrText xml:space="preserve"> PAGEREF _Toc20097 \h </w:instrText>
+        <w:instrText xml:space="preserve"> PAGEREF _Toc1118 \h </w:instrText>
       </w:r>
       <w:r>
         <w:fldChar w:fldCharType="separate"/>
       </w:r>
       <w:r>
-        <w:t>27</w:t>
+        <w:t>31</w:t>
       </w:r>
       <w:r>
         <w:fldChar w:fldCharType="end"/>
@@ -2979,7 +3339,7 @@
           <w:bCs/>
         </w:rPr>
       </w:pPr>
-      <w:bookmarkStart w:id="2" w:name="_Toc17590"/>
+      <w:bookmarkStart w:id="2" w:name="_Toc32053"/>
       <w:r>
         <w:rPr>
           <w:b/>
@@ -3052,7 +3412,7 @@
           <w:lang w:val="vi-VN"/>
         </w:rPr>
       </w:pPr>
-      <w:bookmarkStart w:id="3" w:name="_Toc5429"/>
+      <w:bookmarkStart w:id="3" w:name="_Toc27230"/>
       <w:r>
         <w:rPr>
           <w:rFonts w:hint="default"/>
@@ -7337,7 +7697,7 @@
           <w:bCs/>
         </w:rPr>
       </w:pPr>
-      <w:bookmarkStart w:id="4" w:name="_Toc18053"/>
+      <w:bookmarkStart w:id="4" w:name="_Toc27409"/>
       <w:r>
         <w:rPr>
           <w:b/>
@@ -7375,6 +7735,7 @@
         </w:rPr>
         <w:fldChar w:fldCharType="separate"/>
       </w:r>
+      <w:bookmarkStart w:id="5" w:name="_Toc13856"/>
       <w:r>
         <w:rPr>
           <w:bCs/>
@@ -7385,7 +7746,7 @@
         <w:rPr>
           <w:bCs/>
         </w:rPr>
-        <w:instrText xml:space="preserve"> HYPERLINK \l _Toc2956 </w:instrText>
+        <w:instrText xml:space="preserve"> HYPERLINK \l _Toc11617 </w:instrText>
       </w:r>
       <w:r>
         <w:rPr>
@@ -7407,7 +7768,7 @@
         <w:fldChar w:fldCharType="begin"/>
       </w:r>
       <w:r>
-        <w:instrText xml:space="preserve"> PAGEREF _Toc2956 \h </w:instrText>
+        <w:instrText xml:space="preserve"> PAGEREF _Toc11617 \h </w:instrText>
       </w:r>
       <w:r>
         <w:fldChar w:fldCharType="separate"/>
@@ -7442,7 +7803,7 @@
         <w:rPr>
           <w:bCs/>
         </w:rPr>
-        <w:instrText xml:space="preserve"> HYPERLINK \l _Toc29468 </w:instrText>
+        <w:instrText xml:space="preserve"> HYPERLINK \l _Toc10348 </w:instrText>
       </w:r>
       <w:r>
         <w:rPr>
@@ -7464,7 +7825,7 @@
         <w:fldChar w:fldCharType="begin"/>
       </w:r>
       <w:r>
-        <w:instrText xml:space="preserve"> PAGEREF _Toc29468 \h </w:instrText>
+        <w:instrText xml:space="preserve"> PAGEREF _Toc10348 \h </w:instrText>
       </w:r>
       <w:r>
         <w:fldChar w:fldCharType="separate"/>
@@ -7499,7 +7860,7 @@
         <w:rPr>
           <w:bCs/>
         </w:rPr>
-        <w:instrText xml:space="preserve"> HYPERLINK \l _Toc14404 </w:instrText>
+        <w:instrText xml:space="preserve"> HYPERLINK \l _Toc19413 </w:instrText>
       </w:r>
       <w:r>
         <w:rPr>
@@ -7524,7 +7885,7 @@
         <w:fldChar w:fldCharType="begin"/>
       </w:r>
       <w:r>
-        <w:instrText xml:space="preserve"> PAGEREF _Toc14404 \h </w:instrText>
+        <w:instrText xml:space="preserve"> PAGEREF _Toc19413 \h </w:instrText>
       </w:r>
       <w:r>
         <w:fldChar w:fldCharType="separate"/>
@@ -7559,7 +7920,7 @@
         <w:rPr>
           <w:bCs/>
         </w:rPr>
-        <w:instrText xml:space="preserve"> HYPERLINK \l _Toc20528 </w:instrText>
+        <w:instrText xml:space="preserve"> HYPERLINK \l _Toc12078 </w:instrText>
       </w:r>
       <w:r>
         <w:rPr>
@@ -7584,7 +7945,7 @@
         <w:fldChar w:fldCharType="begin"/>
       </w:r>
       <w:r>
-        <w:instrText xml:space="preserve"> PAGEREF _Toc20528 \h </w:instrText>
+        <w:instrText xml:space="preserve"> PAGEREF _Toc12078 \h </w:instrText>
       </w:r>
       <w:r>
         <w:fldChar w:fldCharType="separate"/>
@@ -7619,7 +7980,7 @@
         <w:rPr>
           <w:bCs/>
         </w:rPr>
-        <w:instrText xml:space="preserve"> HYPERLINK \l _Toc375 </w:instrText>
+        <w:instrText xml:space="preserve"> HYPERLINK \l _Toc15060 </w:instrText>
       </w:r>
       <w:r>
         <w:rPr>
@@ -7641,7 +8002,7 @@
         <w:fldChar w:fldCharType="begin"/>
       </w:r>
       <w:r>
-        <w:instrText xml:space="preserve"> PAGEREF _Toc375 \h </w:instrText>
+        <w:instrText xml:space="preserve"> PAGEREF _Toc15060 \h </w:instrText>
       </w:r>
       <w:r>
         <w:fldChar w:fldCharType="separate"/>
@@ -7661,34 +8022,123 @@
     </w:p>
     <w:p>
       <w:pPr>
+        <w:pStyle w:val="26"/>
+        <w:tabs>
+          <w:tab w:val="right" w:leader="dot" w:pos="9072"/>
+        </w:tabs>
+      </w:pPr>
+      <w:r>
+        <w:rPr>
+          <w:bCs/>
+        </w:rPr>
+        <w:fldChar w:fldCharType="begin"/>
+      </w:r>
+      <w:r>
+        <w:rPr>
+          <w:bCs/>
+        </w:rPr>
+        <w:instrText xml:space="preserve"> HYPERLINK \l _Toc23421 </w:instrText>
+      </w:r>
+      <w:r>
+        <w:rPr>
+          <w:bCs/>
+        </w:rPr>
+        <w:fldChar w:fldCharType="separate"/>
+      </w:r>
+      <w:r>
+        <w:rPr>
+          <w:rFonts w:hint="default"/>
+          <w:lang w:val="vi-VN"/>
+        </w:rPr>
+        <w:t>Bảng 2.6: So sánh giữa Node.js và Spring Boot</w:t>
+      </w:r>
+      <w:r>
+        <w:tab/>
+      </w:r>
+      <w:r>
+        <w:fldChar w:fldCharType="begin"/>
+      </w:r>
+      <w:r>
+        <w:instrText xml:space="preserve"> PAGEREF _Toc23421 \h </w:instrText>
+      </w:r>
+      <w:r>
+        <w:fldChar w:fldCharType="separate"/>
+      </w:r>
+      <w:r>
+        <w:t>29</w:t>
+      </w:r>
+      <w:r>
+        <w:fldChar w:fldCharType="end"/>
+      </w:r>
+      <w:r>
+        <w:rPr>
+          <w:bCs/>
+        </w:rPr>
+        <w:fldChar w:fldCharType="end"/>
+      </w:r>
+    </w:p>
+    <w:p>
+      <w:pPr>
+        <w:pStyle w:val="26"/>
+        <w:tabs>
+          <w:tab w:val="right" w:leader="dot" w:pos="9072"/>
+        </w:tabs>
+      </w:pPr>
+      <w:r>
+        <w:rPr>
+          <w:bCs/>
+        </w:rPr>
+        <w:fldChar w:fldCharType="begin"/>
+      </w:r>
+      <w:r>
+        <w:rPr>
+          <w:bCs/>
+        </w:rPr>
+        <w:instrText xml:space="preserve"> HYPERLINK \l _Toc16544 </w:instrText>
+      </w:r>
+      <w:r>
+        <w:rPr>
+          <w:bCs/>
+        </w:rPr>
+        <w:fldChar w:fldCharType="separate"/>
+      </w:r>
+      <w:r>
+        <w:rPr>
+          <w:rFonts w:hint="default"/>
+          <w:lang w:val="vi-VN"/>
+        </w:rPr>
+        <w:t>Hình 2.1: Cấu trúc thư mục ai_service trong dự án</w:t>
+      </w:r>
+      <w:r>
+        <w:tab/>
+      </w:r>
+      <w:r>
+        <w:fldChar w:fldCharType="begin"/>
+      </w:r>
+      <w:r>
+        <w:instrText xml:space="preserve"> PAGEREF _Toc16544 \h </w:instrText>
+      </w:r>
+      <w:r>
+        <w:fldChar w:fldCharType="separate"/>
+      </w:r>
+      <w:r>
+        <w:t>30</w:t>
+      </w:r>
+      <w:r>
+        <w:fldChar w:fldCharType="end"/>
+      </w:r>
+      <w:r>
+        <w:rPr>
+          <w:bCs/>
+        </w:rPr>
+        <w:fldChar w:fldCharType="end"/>
+      </w:r>
+    </w:p>
+    <w:p>
+      <w:pPr>
         <w:pStyle w:val="35"/>
         <w:bidi w:val="0"/>
         <w:ind w:left="0" w:leftChars="0" w:firstLine="0" w:firstLineChars="0"/>
-        <w:jc w:val="both"/>
-        <w:outlineLvl w:val="0"/>
-        <w:rPr>
-          <w:rFonts w:ascii="Times New Roman" w:hAnsi="Times New Roman"/>
-          <w:b/>
-        </w:rPr>
-      </w:pPr>
-      <w:r>
-        <w:rPr>
-          <w:bCs/>
-        </w:rPr>
-        <w:fldChar w:fldCharType="end"/>
-      </w:r>
-      <w:r>
-        <w:rPr>
-          <w:rFonts w:ascii="Times New Roman" w:hAnsi="Times New Roman"/>
-          <w:b/>
-        </w:rPr>
-        <w:br w:type="page"/>
-      </w:r>
-    </w:p>
-    <w:p>
-      <w:pPr>
-        <w:pStyle w:val="35"/>
-        <w:bidi w:val="0"/>
         <w:jc w:val="center"/>
         <w:outlineLvl w:val="0"/>
         <w:rPr>
@@ -7696,7 +8146,15 @@
           <w:bCs/>
         </w:rPr>
       </w:pPr>
-      <w:bookmarkStart w:id="5" w:name="_Toc2804"/>
+      <w:r>
+        <w:rPr>
+          <w:bCs/>
+        </w:rPr>
+        <w:fldChar w:fldCharType="end"/>
+      </w:r>
+      <w:r>
+        <w:br w:type="page"/>
+      </w:r>
       <w:r>
         <w:rPr>
           <w:b/>
@@ -7743,7 +8201,7 @@
         </w:rPr>
         <w:t xml:space="preserve"> </w:t>
       </w:r>
-      <w:bookmarkStart w:id="6" w:name="_Toc18313"/>
+      <w:bookmarkStart w:id="6" w:name="_Toc15471"/>
       <w:r>
         <w:rPr>
           <w:rFonts w:hint="default"/>
@@ -7767,7 +8225,7 @@
         </w:rPr>
         <w:t xml:space="preserve"> </w:t>
       </w:r>
-      <w:bookmarkStart w:id="7" w:name="_Toc11935"/>
+      <w:bookmarkStart w:id="7" w:name="_Toc17985"/>
       <w:r>
         <w:rPr>
           <w:lang w:val="vi-VN"/>
@@ -7822,7 +8280,7 @@
         </w:rPr>
         <w:t xml:space="preserve"> </w:t>
       </w:r>
-      <w:bookmarkStart w:id="8" w:name="_Toc3986"/>
+      <w:bookmarkStart w:id="8" w:name="_Toc6399"/>
       <w:r>
         <w:rPr>
           <w:lang w:val="vi-VN"/>
@@ -7857,7 +8315,7 @@
         </w:rPr>
         <w:t xml:space="preserve">  </w:t>
       </w:r>
-      <w:bookmarkStart w:id="9" w:name="_Toc9223"/>
+      <w:bookmarkStart w:id="9" w:name="_Toc15578"/>
       <w:r>
         <w:rPr>
           <w:lang w:val="vi-VN"/>
@@ -7906,7 +8364,7 @@
         </w:rPr>
         <w:t xml:space="preserve"> </w:t>
       </w:r>
-      <w:bookmarkStart w:id="10" w:name="_Toc4842"/>
+      <w:bookmarkStart w:id="10" w:name="_Toc30455"/>
       <w:r>
         <w:rPr>
           <w:lang w:val="vi-VN"/>
@@ -7950,7 +8408,7 @@
         </w:rPr>
         <w:t xml:space="preserve"> </w:t>
       </w:r>
-      <w:bookmarkStart w:id="11" w:name="_Toc2791"/>
+      <w:bookmarkStart w:id="11" w:name="_Toc10691"/>
       <w:r>
         <w:rPr>
           <w:lang w:val="vi-VN"/>
@@ -8070,7 +8528,7 @@
           <w:lang w:val="vi-VN" w:eastAsia="zh-CN"/>
         </w:rPr>
       </w:pPr>
-      <w:bookmarkStart w:id="12" w:name="_Toc14512"/>
+      <w:bookmarkStart w:id="12" w:name="_Toc14181"/>
       <w:r>
         <w:rPr>
           <w:rFonts w:hint="default"/>
@@ -8085,7 +8543,7 @@
         <w:pStyle w:val="3"/>
         <w:bidi w:val="0"/>
       </w:pPr>
-      <w:bookmarkStart w:id="13" w:name="_Toc772"/>
+      <w:bookmarkStart w:id="13" w:name="_Toc30"/>
       <w:r>
         <w:t>Tổng quan hệ thống quản lý nhà hàng</w:t>
       </w:r>
@@ -8148,7 +8606,7 @@
         <w:pStyle w:val="3"/>
         <w:bidi w:val="0"/>
       </w:pPr>
-      <w:bookmarkStart w:id="14" w:name="_Toc10798"/>
+      <w:bookmarkStart w:id="14" w:name="_Toc26114"/>
       <w:r>
         <w:t>Các phương pháp gợi ý trong Machine Learning</w:t>
       </w:r>
@@ -8171,7 +8629,7 @@
         <w:pStyle w:val="4"/>
         <w:bidi w:val="0"/>
       </w:pPr>
-      <w:bookmarkStart w:id="15" w:name="_Toc24241"/>
+      <w:bookmarkStart w:id="15" w:name="_Toc30042"/>
       <w:r>
         <w:t>Lọc dựa trên nội dung (Content-Based Filtering)</w:t>
       </w:r>
@@ -8520,7 +8978,7 @@
           <w:lang w:val="vi-VN"/>
         </w:rPr>
       </w:pPr>
-      <w:bookmarkStart w:id="16" w:name="_Toc2956"/>
+      <w:bookmarkStart w:id="16" w:name="_Toc11617"/>
       <w:r>
         <w:rPr>
           <w:rFonts w:hint="default"/>
@@ -8565,15 +9023,7 @@
         <w:t xml:space="preserve"> </w:t>
       </w:r>
       <w:r>
-        <w:t xml:space="preserve">Dựa vào đặc điểm đó, hệ thống sẽ tìm các món ăn khác có cùng hoặc </w:t>
-      </w:r>
-      <w:bookmarkStart w:id="42" w:name="_GoBack"/>
-      <w:r>
-        <w:t>tương tự đặ</w:t>
-      </w:r>
-      <w:bookmarkEnd w:id="42"/>
-      <w:r>
-        <w:t>c điểm để đưa ra gợi ý. Trong trường hợp này, các món như Cơm bò hoặc Cơm chiên cũng thuộc cùng nhóm, nên được đề xuất cho khách A.</w:t>
+        <w:t>Dựa vào đặc điểm đó, hệ thống sẽ tìm các món ăn khác có cùng hoặc tương tự đặc điểm để đưa ra gợi ý. Trong trường hợp này, các món như Cơm bò hoặc Cơm chiên cũng thuộc cùng nhóm, nên được đề xuất cho khách A.</w:t>
       </w:r>
       <w:r>
         <w:rPr>
@@ -8594,7 +9044,7 @@
       <w:r>
         <w:t xml:space="preserve"> </w:t>
       </w:r>
-      <w:bookmarkStart w:id="17" w:name="_Toc19921"/>
+      <w:bookmarkStart w:id="17" w:name="_Toc16567"/>
       <w:r>
         <w:t>Lọc cộng tác (Collaborative Filtering)</w:t>
       </w:r>
@@ -8818,6 +9268,7 @@
             <w:insideH w:val="single" w:color="000000" w:sz="2" w:space="0"/>
             <w:insideV w:val="single" w:color="000000" w:sz="2" w:space="0"/>
           </w:tblBorders>
+          <w:shd w:val="clear" w:color="auto" w:fill="auto"/>
           <w:tblCellMar>
             <w:top w:w="15" w:type="dxa"/>
             <w:left w:w="15" w:type="dxa"/>
@@ -8916,6 +9367,7 @@
             <w:insideH w:val="single" w:color="000000" w:sz="2" w:space="0"/>
             <w:insideV w:val="single" w:color="000000" w:sz="2" w:space="0"/>
           </w:tblBorders>
+          <w:shd w:val="clear" w:color="auto" w:fill="auto"/>
           <w:tblCellMar>
             <w:top w:w="15" w:type="dxa"/>
             <w:left w:w="15" w:type="dxa"/>
@@ -9014,6 +9466,7 @@
             <w:insideH w:val="single" w:color="000000" w:sz="2" w:space="0"/>
             <w:insideV w:val="single" w:color="000000" w:sz="2" w:space="0"/>
           </w:tblBorders>
+          <w:shd w:val="clear" w:color="auto" w:fill="auto"/>
           <w:tblCellMar>
             <w:top w:w="15" w:type="dxa"/>
             <w:left w:w="15" w:type="dxa"/>
@@ -9112,7 +9565,7 @@
           <w:lang w:val="vi-VN"/>
         </w:rPr>
       </w:pPr>
-      <w:bookmarkStart w:id="18" w:name="_Toc29468"/>
+      <w:bookmarkStart w:id="18" w:name="_Toc10348"/>
       <w:r>
         <w:rPr>
           <w:rFonts w:hint="default"/>
@@ -9178,7 +9631,7 @@
         <w:pStyle w:val="4"/>
         <w:bidi w:val="0"/>
       </w:pPr>
-      <w:bookmarkStart w:id="19" w:name="_Toc31337"/>
+      <w:bookmarkStart w:id="19" w:name="_Toc32039"/>
       <w:r>
         <w:t>Gợi ý dựa trên độ phổ biến (Popularity-Based)</w:t>
       </w:r>
@@ -9248,6 +9701,15 @@
       </w:tblGrid>
       <w:tr>
         <w:tblPrEx>
+          <w:tblBorders>
+            <w:top w:val="single" w:color="000000" w:sz="2" w:space="0"/>
+            <w:left w:val="single" w:color="000000" w:sz="2" w:space="0"/>
+            <w:bottom w:val="single" w:color="000000" w:sz="2" w:space="0"/>
+            <w:right w:val="single" w:color="000000" w:sz="2" w:space="0"/>
+            <w:insideH w:val="single" w:color="000000" w:sz="2" w:space="0"/>
+            <w:insideV w:val="single" w:color="000000" w:sz="2" w:space="0"/>
+          </w:tblBorders>
+          <w:shd w:val="clear" w:color="auto" w:fill="auto"/>
           <w:tblCellMar>
             <w:top w:w="15" w:type="dxa"/>
             <w:left w:w="15" w:type="dxa"/>
@@ -9514,7 +9976,7 @@
         <w:pStyle w:val="13"/>
         <w:bidi w:val="0"/>
       </w:pPr>
-      <w:bookmarkStart w:id="20" w:name="_Toc14404"/>
+      <w:bookmarkStart w:id="20" w:name="_Toc19413"/>
       <w:r>
         <w:rPr>
           <w:rFonts w:hint="default"/>
@@ -9590,7 +10052,7 @@
         <w:pStyle w:val="4"/>
         <w:bidi w:val="0"/>
       </w:pPr>
-      <w:bookmarkStart w:id="21" w:name="_Toc26338"/>
+      <w:bookmarkStart w:id="21" w:name="_Toc3121"/>
       <w:r>
         <w:t>Phương pháp kết hợp (Hybrid)</w:t>
       </w:r>
@@ -9899,7 +10361,7 @@
         <w:pStyle w:val="13"/>
         <w:bidi w:val="0"/>
       </w:pPr>
-      <w:bookmarkStart w:id="22" w:name="_Toc20528"/>
+      <w:bookmarkStart w:id="22" w:name="_Toc12078"/>
       <w:r>
         <w:rPr>
           <w:rFonts w:hint="default"/>
@@ -9968,7 +10430,7 @@
           <w:lang w:val="vi-VN"/>
         </w:rPr>
       </w:pPr>
-      <w:bookmarkStart w:id="23" w:name="_Toc27172"/>
+      <w:bookmarkStart w:id="23" w:name="_Toc29234"/>
       <w:r>
         <w:rPr>
           <w:rFonts w:hint="default"/>
@@ -9987,7 +10449,7 @@
           <w:lang w:val="vi-VN"/>
         </w:rPr>
       </w:pPr>
-      <w:bookmarkStart w:id="24" w:name="_Toc26633"/>
+      <w:bookmarkStart w:id="24" w:name="_Toc9788"/>
       <w:r>
         <w:rPr>
           <w:rFonts w:hint="default"/>
@@ -10055,7 +10517,7 @@
         <w:pStyle w:val="4"/>
         <w:bidi w:val="0"/>
       </w:pPr>
-      <w:bookmarkStart w:id="25" w:name="_Toc29259"/>
+      <w:bookmarkStart w:id="25" w:name="_Toc14760"/>
       <w:r>
         <w:t>Ứng dụng trong hệ thống nhà hàng</w:t>
       </w:r>
@@ -10215,7 +10677,7 @@
         <w:pStyle w:val="4"/>
         <w:bidi w:val="0"/>
       </w:pPr>
-      <w:bookmarkStart w:id="26" w:name="_Toc14047"/>
+      <w:bookmarkStart w:id="26" w:name="_Toc2998"/>
       <w:r>
         <w:t>Các chỉ số quan trọng</w:t>
       </w:r>
@@ -10342,7 +10804,7 @@
         <w:pStyle w:val="3"/>
         <w:bidi w:val="0"/>
       </w:pPr>
-      <w:bookmarkStart w:id="27" w:name="_Toc12678"/>
+      <w:bookmarkStart w:id="27" w:name="_Toc24518"/>
       <w:r>
         <w:t>Bài toán minh họa: Áp dụng thuật toán Apriori trong hệ thống nhà hàng</w:t>
       </w:r>
@@ -10851,7 +11313,7 @@
           <w:lang w:val="vi-VN"/>
         </w:rPr>
       </w:pPr>
-      <w:bookmarkStart w:id="28" w:name="_Toc375"/>
+      <w:bookmarkStart w:id="28" w:name="_Toc15060"/>
       <w:r>
         <w:rPr>
           <w:rFonts w:hint="default"/>
@@ -11339,45 +11801,2306 @@
         <w:t>→ Giúp gợi ý luôn theo xu hướng mới</w:t>
       </w:r>
     </w:p>
-    <w:p/>
     <w:p>
       <w:pPr>
         <w:pStyle w:val="3"/>
         <w:bidi w:val="0"/>
       </w:pPr>
-      <w:bookmarkStart w:id="29" w:name="_Toc20763"/>
-      <w:r>
-        <w:t>NodeJS và ExpressJS</w:t>
+      <w:bookmarkStart w:id="29" w:name="_Toc30554"/>
+      <w:r>
+        <w:t>NodeJS</w:t>
       </w:r>
       <w:bookmarkEnd w:id="29"/>
+    </w:p>
+    <w:p>
+      <w:pPr>
+        <w:pStyle w:val="4"/>
+        <w:bidi w:val="0"/>
+      </w:pPr>
+      <w:bookmarkStart w:id="30" w:name="_Toc24070"/>
+      <w:r>
+        <w:rPr>
+          <w:rFonts w:hint="default"/>
+          <w:lang w:val="vi-VN"/>
+        </w:rPr>
+        <w:t>Khái niệm về NodeJS</w:t>
+      </w:r>
+      <w:bookmarkEnd w:id="30"/>
+    </w:p>
+    <w:p>
+      <w:pPr>
+        <w:pStyle w:val="35"/>
+        <w:bidi w:val="0"/>
+        <w:rPr>
+          <w:rFonts w:hint="default"/>
+        </w:rPr>
+      </w:pPr>
+      <w:r>
+        <w:rPr>
+          <w:rFonts w:hint="default"/>
+          <w:lang w:val="vi-VN"/>
+        </w:rPr>
+        <w:t xml:space="preserve">Để bắt đầu tìm hiểu về Express JS, chúng ta cần quay lại tìm hiểu nền tảng gốc rễ của nó là Node.js. Dễ hiểu hơn Node.js không phải là một ngôn ngữ lập trình mới, cũng không phải là framework, </w:t>
+      </w:r>
       <w:r>
         <w:t xml:space="preserve"> </w:t>
       </w:r>
+      <w:r>
+        <w:rPr>
+          <w:rFonts w:hint="default"/>
+          <w:lang w:val="en-US" w:eastAsia="zh-CN"/>
+        </w:rPr>
+        <w:t xml:space="preserve">mà nó là một môi trường chạy mã </w:t>
+      </w:r>
+      <w:r>
+        <w:rPr>
+          <w:rFonts w:hint="default"/>
+          <w:lang w:val="vi-VN" w:eastAsia="zh-CN"/>
+        </w:rPr>
+        <w:t xml:space="preserve"> </w:t>
+      </w:r>
+      <w:r>
+        <w:rPr>
+          <w:rFonts w:hint="default"/>
+          <w:lang w:val="en-US" w:eastAsia="zh-CN"/>
+        </w:rPr>
+        <w:t>(runtime</w:t>
+      </w:r>
+      <w:r>
+        <w:rPr>
+          <w:rFonts w:hint="default"/>
+          <w:lang w:val="vi-VN" w:eastAsia="zh-CN"/>
+        </w:rPr>
+        <w:t xml:space="preserve"> </w:t>
+      </w:r>
+      <w:r>
+        <w:rPr>
+          <w:rFonts w:hint="default"/>
+          <w:lang w:val="en-US" w:eastAsia="zh-CN"/>
+        </w:rPr>
+        <w:t>environment) đa nền tảng cho JavaScript. Trước đây, JavaScript chỉ sống trong trình duyệt web để tạo hiệu ứng</w:t>
+      </w:r>
+      <w:r>
+        <w:rPr>
+          <w:rFonts w:hint="default"/>
+          <w:lang w:val="vi-VN" w:eastAsia="zh-CN"/>
+        </w:rPr>
+        <w:t xml:space="preserve"> </w:t>
+      </w:r>
+      <w:r>
+        <w:rPr>
+          <w:rFonts w:hint="default"/>
+          <w:lang w:val="en-US" w:eastAsia="zh-CN"/>
+        </w:rPr>
+        <w:t xml:space="preserve">cho frontend, nhưng sự ra đời của Node.js vào năm 2009 đã mang JavaScript ra khỏi trình duyệt để chạy trên máy chủ </w:t>
+      </w:r>
+      <w:r>
+        <w:rPr>
+          <w:rFonts w:hint="default"/>
+          <w:lang w:val="vi-VN" w:eastAsia="zh-CN"/>
+        </w:rPr>
+        <w:t xml:space="preserve"> </w:t>
+      </w:r>
+      <w:r>
+        <w:rPr>
+          <w:rFonts w:hint="default"/>
+          <w:lang w:val="en-US" w:eastAsia="zh-CN"/>
+        </w:rPr>
+        <w:t xml:space="preserve">(server), cho phép lập trình viên dùng một ngôn ngữ duy nhất cho cả frontend và backend. </w:t>
+      </w:r>
+    </w:p>
+    <w:p>
+      <w:pPr>
+        <w:pStyle w:val="4"/>
+        <w:bidi w:val="0"/>
+      </w:pPr>
+      <w:bookmarkStart w:id="31" w:name="_Toc10169"/>
+      <w:r>
+        <w:t>Đặc điểm chính</w:t>
+      </w:r>
+      <w:bookmarkEnd w:id="31"/>
+    </w:p>
+    <w:p>
+      <w:pPr>
+        <w:pStyle w:val="35"/>
+        <w:bidi w:val="0"/>
+      </w:pPr>
+      <w:r>
+        <w:t>Điểm mạnh nổi bật của Node.js nằm ở kiến trúc hướng sự kiện (event-driven) kết hợp với mô hình non-blocking I/O (xử lý vào/ra không chặn). Với cơ chế này, hệ thống không cần chờ một tác vụ tốn thời gian (như đọc file hay truy vấn cơ sở dữ liệu) hoàn tất mới tiếp tục xử lý tác vụ khác. Thay vào đó, Node.js sẽ gửi yêu cầu đi xử lý và ngay lập tức tiếp nhận các yêu cầu mới.</w:t>
+      </w:r>
+      <w:r>
+        <w:rPr>
+          <w:rFonts w:hint="default"/>
+          <w:lang w:val="vi-VN"/>
+        </w:rPr>
+        <w:t xml:space="preserve"> </w:t>
+      </w:r>
+      <w:r>
+        <w:t>Nhờ vậy, Node.js có khả năng xử lý đồng thời nhiều kết nối với mức tiêu thụ tài nguyên thấp, đặc biệt phù hợp với các ứng dụng thời gian thực và hệ thống có lưu lượng truy cập lớn.</w:t>
+      </w:r>
+    </w:p>
+    <w:p>
+      <w:pPr>
+        <w:pStyle w:val="4"/>
+        <w:keepNext w:val="0"/>
+        <w:keepLines w:val="0"/>
+        <w:widowControl/>
+        <w:suppressLineNumbers w:val="0"/>
+      </w:pPr>
+      <w:bookmarkStart w:id="32" w:name="_Toc32686"/>
+      <w:r>
+        <w:t>Hạn chế</w:t>
+      </w:r>
+      <w:bookmarkEnd w:id="32"/>
+    </w:p>
+    <w:p>
+      <w:pPr>
+        <w:pStyle w:val="35"/>
+        <w:bidi w:val="0"/>
+      </w:pPr>
+      <w:r>
+        <w:rPr>
+          <w:sz w:val="26"/>
+        </w:rPr>
+        <mc:AlternateContent>
+          <mc:Choice Requires="wps">
+            <w:drawing>
+              <wp:anchor distT="0" distB="0" distL="114300" distR="114300" simplePos="0" relativeHeight="251667456" behindDoc="0" locked="0" layoutInCell="1" allowOverlap="1">
+                <wp:simplePos x="0" y="0"/>
+                <wp:positionH relativeFrom="column">
+                  <wp:posOffset>141605</wp:posOffset>
+                </wp:positionH>
+                <wp:positionV relativeFrom="paragraph">
+                  <wp:posOffset>2882265</wp:posOffset>
+                </wp:positionV>
+                <wp:extent cx="5535930" cy="2576830"/>
+                <wp:effectExtent l="6350" t="6350" r="20320" b="7620"/>
+                <wp:wrapNone/>
+                <wp:docPr id="7" name="Rectangle 7"/>
+                <wp:cNvGraphicFramePr/>
+                <a:graphic xmlns:a="http://schemas.openxmlformats.org/drawingml/2006/main">
+                  <a:graphicData uri="http://schemas.microsoft.com/office/word/2010/wordprocessingShape">
+                    <wps:wsp>
+                      <wps:cNvSpPr/>
+                      <wps:spPr>
+                        <a:xfrm>
+                          <a:off x="0" y="0"/>
+                          <a:ext cx="5535930" cy="2576830"/>
+                        </a:xfrm>
+                        <a:prstGeom prst="rect">
+                          <a:avLst/>
+                        </a:prstGeom>
+                        <a:ln>
+                          <a:solidFill>
+                            <a:schemeClr val="tx1"/>
+                          </a:solidFill>
+                        </a:ln>
+                      </wps:spPr>
+                      <wps:style>
+                        <a:lnRef idx="2">
+                          <a:schemeClr val="accent1"/>
+                        </a:lnRef>
+                        <a:fillRef idx="0">
+                          <a:srgbClr val="FFFFFF"/>
+                        </a:fillRef>
+                        <a:effectRef idx="0">
+                          <a:srgbClr val="FFFFFF"/>
+                        </a:effectRef>
+                        <a:fontRef idx="minor">
+                          <a:schemeClr val="tx1"/>
+                        </a:fontRef>
+                      </wps:style>
+                      <wps:bodyPr rot="0" spcFirstLastPara="0" vertOverflow="overflow" horzOverflow="overflow" vert="horz" wrap="square" lIns="91440" tIns="45720" rIns="91440" bIns="45720" numCol="1" spcCol="0" rtlCol="0" fromWordArt="0" anchor="ctr" anchorCtr="0" forceAA="0" compatLnSpc="1">
+                        <a:noAutofit/>
+                      </wps:bodyPr>
+                    </wps:wsp>
+                  </a:graphicData>
+                </a:graphic>
+              </wp:anchor>
+            </w:drawing>
+          </mc:Choice>
+          <mc:Fallback>
+            <w:pict>
+              <v:rect id="_x0000_s1026" o:spid="_x0000_s1026" o:spt="1" style="position:absolute;left:0pt;margin-left:11.15pt;margin-top:226.95pt;height:202.9pt;width:435.9pt;z-index:251667456;v-text-anchor:middle;mso-width-relative:page;mso-height-relative:page;" filled="f" stroked="t" coordsize="21600,21600" o:gfxdata="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">
+                <v:fill on="f" focussize="0,0"/>
+                <v:stroke weight="1pt" color="#000000 [3213]" miterlimit="8" joinstyle="miter"/>
+                <v:imagedata o:title=""/>
+                <o:lock v:ext="edit" aspectratio="f"/>
+              </v:rect>
+            </w:pict>
+          </mc:Fallback>
+        </mc:AlternateContent>
+      </w:r>
+      <w:r>
+        <w:t>Mặc dù mang lại hiệu năng cao, việc sử dụng Node.js thuần túy vẫn tồn tại một số hạn chế nhất định. Khi xây dựng web server chỉ dựa trên các module tích hợp sẵn như http, lập trình viên phải tự triển khai nhiều chức năng cơ bản.</w:t>
+      </w:r>
+      <w:r>
+        <w:rPr>
+          <w:rFonts w:hint="default"/>
+          <w:lang w:val="vi-VN"/>
+        </w:rPr>
+        <w:t xml:space="preserve"> </w:t>
+      </w:r>
+      <w:r>
+        <w:t>Cụ thể, các tác vụ như:</w:t>
+      </w:r>
+      <w:r>
+        <w:rPr>
+          <w:rFonts w:hint="default"/>
+          <w:lang w:val="vi-VN"/>
+        </w:rPr>
+        <w:t xml:space="preserve"> </w:t>
+      </w:r>
+      <w:r>
+        <w:t>Định tuyến (routing) cho từng URL</w:t>
+      </w:r>
+      <w:r>
+        <w:rPr>
+          <w:rFonts w:hint="default"/>
+          <w:lang w:val="vi-VN"/>
+        </w:rPr>
+        <w:t xml:space="preserve">. </w:t>
+      </w:r>
+      <w:r>
+        <w:t>Xử lý các phương thức HTTP (GET, POST, PUT, DELETE)</w:t>
+      </w:r>
+      <w:r>
+        <w:rPr>
+          <w:rFonts w:hint="default"/>
+          <w:lang w:val="vi-VN"/>
+        </w:rPr>
+        <w:t xml:space="preserve">. </w:t>
+      </w:r>
+      <w:r>
+        <w:t>Quản lý và phân phối tài nguyên tĩnh đều cần được xử lý thủ công thông qua các cấu trúc điều kiện phức tạp. Điều này dẫn đến việc mã nguồn trở nên dài dòng, khó tổ chức và gây khó khăn trong quá trình bảo trì, mở rộng hệ thống.</w:t>
+      </w:r>
+      <w:r>
+        <w:rPr>
+          <w:rFonts w:hint="default"/>
+          <w:lang w:val="vi-VN"/>
+        </w:rPr>
+        <w:t xml:space="preserve"> </w:t>
+      </w:r>
+      <w:r>
+        <w:t>Chính những hạn chế về tính tiện dụng và thiếu các công cụ hỗ trợ chuyên biệt đã thúc đẩy sự ra đời của Express.js — một framework giúp đơn giản hóa quá trình phát triển ứng dụng web trên nền tảng Node.js.</w:t>
+      </w:r>
+    </w:p>
+    <w:p>
+      <w:pPr>
+        <w:pStyle w:val="35"/>
+        <w:bidi w:val="0"/>
+        <w:rPr>
+          <w:rFonts w:hint="default" w:ascii="Courier New" w:hAnsi="Courier New" w:cs="Courier New"/>
+        </w:rPr>
+      </w:pPr>
+      <w:r>
+        <w:rPr>
+          <w:rFonts w:hint="default" w:ascii="Courier New" w:hAnsi="Courier New" w:cs="Courier New"/>
+        </w:rPr>
+        <w:t>const http = require('http');</w:t>
+      </w:r>
+    </w:p>
+    <w:p>
+      <w:pPr>
+        <w:pStyle w:val="35"/>
+        <w:bidi w:val="0"/>
+        <w:rPr>
+          <w:rFonts w:hint="default" w:ascii="Courier New" w:hAnsi="Courier New" w:cs="Courier New"/>
+        </w:rPr>
+      </w:pPr>
+      <w:r>
+        <w:rPr>
+          <w:rFonts w:hint="default" w:ascii="Courier New" w:hAnsi="Courier New" w:cs="Courier New"/>
+        </w:rPr>
+        <w:t>// Tạo server</w:t>
+      </w:r>
+    </w:p>
+    <w:p>
+      <w:pPr>
+        <w:pStyle w:val="35"/>
+        <w:bidi w:val="0"/>
+        <w:rPr>
+          <w:rFonts w:hint="default" w:ascii="Courier New" w:hAnsi="Courier New" w:cs="Courier New"/>
+        </w:rPr>
+      </w:pPr>
+      <w:r>
+        <w:rPr>
+          <w:rFonts w:hint="default" w:ascii="Courier New" w:hAnsi="Courier New" w:cs="Courier New"/>
+        </w:rPr>
+        <w:t>const server = http.createServer((req, res) =&gt; {</w:t>
+      </w:r>
+    </w:p>
+    <w:p>
+      <w:pPr>
+        <w:pStyle w:val="35"/>
+        <w:bidi w:val="0"/>
+        <w:rPr>
+          <w:rFonts w:hint="default" w:ascii="Courier New" w:hAnsi="Courier New" w:cs="Courier New"/>
+        </w:rPr>
+      </w:pPr>
+      <w:r>
+        <w:rPr>
+          <w:rFonts w:hint="default" w:ascii="Courier New" w:hAnsi="Courier New" w:cs="Courier New"/>
+        </w:rPr>
+        <w:t xml:space="preserve">    // Thiết lập header</w:t>
+      </w:r>
+    </w:p>
+    <w:p>
+      <w:pPr>
+        <w:pStyle w:val="35"/>
+        <w:bidi w:val="0"/>
+        <w:ind w:left="519" w:leftChars="236" w:firstLine="590" w:firstLineChars="227"/>
+        <w:rPr>
+          <w:rFonts w:hint="default" w:ascii="Courier New" w:hAnsi="Courier New" w:cs="Courier New"/>
+        </w:rPr>
+      </w:pPr>
+      <w:r>
+        <w:rPr>
+          <w:rFonts w:hint="default" w:ascii="Courier New" w:hAnsi="Courier New" w:cs="Courier New"/>
+        </w:rPr>
+        <w:t xml:space="preserve">    res.writeHead(200, {'Content-Type': 'text/plain'});</w:t>
+      </w:r>
+    </w:p>
+    <w:p>
+      <w:pPr>
+        <w:pStyle w:val="35"/>
+        <w:bidi w:val="0"/>
+        <w:rPr>
+          <w:rFonts w:hint="default" w:ascii="Courier New" w:hAnsi="Courier New" w:cs="Courier New"/>
+        </w:rPr>
+      </w:pPr>
+      <w:r>
+        <w:rPr>
+          <w:rFonts w:hint="default" w:ascii="Courier New" w:hAnsi="Courier New" w:cs="Courier New"/>
+        </w:rPr>
+        <w:t xml:space="preserve">    // Trả dữ liệu về trình duyệt</w:t>
+      </w:r>
+    </w:p>
+    <w:p>
+      <w:pPr>
+        <w:pStyle w:val="35"/>
+        <w:bidi w:val="0"/>
+        <w:rPr>
+          <w:rFonts w:hint="default" w:ascii="Courier New" w:hAnsi="Courier New" w:cs="Courier New"/>
+        </w:rPr>
+      </w:pPr>
+      <w:r>
+        <w:rPr>
+          <w:sz w:val="26"/>
+        </w:rPr>
+        <mc:AlternateContent>
+          <mc:Choice Requires="wps">
+            <w:drawing>
+              <wp:anchor distT="0" distB="0" distL="114300" distR="114300" simplePos="0" relativeHeight="251666432" behindDoc="0" locked="0" layoutInCell="1" allowOverlap="1">
+                <wp:simplePos x="0" y="0"/>
+                <wp:positionH relativeFrom="column">
+                  <wp:posOffset>24130</wp:posOffset>
+                </wp:positionH>
+                <wp:positionV relativeFrom="paragraph">
+                  <wp:posOffset>-125095</wp:posOffset>
+                </wp:positionV>
+                <wp:extent cx="5680075" cy="2576830"/>
+                <wp:effectExtent l="6350" t="6350" r="13335" b="7620"/>
+                <wp:wrapNone/>
+                <wp:docPr id="3" name="Rectangle 3"/>
+                <wp:cNvGraphicFramePr/>
+                <a:graphic xmlns:a="http://schemas.openxmlformats.org/drawingml/2006/main">
+                  <a:graphicData uri="http://schemas.microsoft.com/office/word/2010/wordprocessingShape">
+                    <wps:wsp>
+                      <wps:cNvSpPr/>
+                      <wps:spPr>
+                        <a:xfrm>
+                          <a:off x="1069340" y="7270750"/>
+                          <a:ext cx="5680075" cy="2576830"/>
+                        </a:xfrm>
+                        <a:prstGeom prst="rect">
+                          <a:avLst/>
+                        </a:prstGeom>
+                        <a:ln>
+                          <a:solidFill>
+                            <a:schemeClr val="tx1"/>
+                          </a:solidFill>
+                        </a:ln>
+                      </wps:spPr>
+                      <wps:style>
+                        <a:lnRef idx="2">
+                          <a:schemeClr val="accent1"/>
+                        </a:lnRef>
+                        <a:fillRef idx="0">
+                          <a:srgbClr val="FFFFFF"/>
+                        </a:fillRef>
+                        <a:effectRef idx="0">
+                          <a:srgbClr val="FFFFFF"/>
+                        </a:effectRef>
+                        <a:fontRef idx="minor">
+                          <a:schemeClr val="tx1"/>
+                        </a:fontRef>
+                      </wps:style>
+                      <wps:bodyPr rot="0" spcFirstLastPara="0" vertOverflow="overflow" horzOverflow="overflow" vert="horz" wrap="square" lIns="91440" tIns="45720" rIns="91440" bIns="45720" numCol="1" spcCol="0" rtlCol="0" fromWordArt="0" anchor="ctr" anchorCtr="0" forceAA="0" compatLnSpc="1">
+                        <a:noAutofit/>
+                      </wps:bodyPr>
+                    </wps:wsp>
+                  </a:graphicData>
+                </a:graphic>
+              </wp:anchor>
+            </w:drawing>
+          </mc:Choice>
+          <mc:Fallback>
+            <w:pict>
+              <v:rect id="_x0000_s1026" o:spid="_x0000_s1026" o:spt="1" style="position:absolute;left:0pt;margin-left:1.9pt;margin-top:-9.85pt;height:202.9pt;width:447.25pt;z-index:251666432;v-text-anchor:middle;mso-width-relative:page;mso-height-relative:page;" filled="f" stroked="t" coordsize="21600,21600" o:gfxdata="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">
+                <v:fill on="f" focussize="0,0"/>
+                <v:stroke weight="1pt" color="#000000 [3213]" miterlimit="8" joinstyle="miter"/>
+                <v:imagedata o:title=""/>
+                <o:lock v:ext="edit" aspectratio="f"/>
+              </v:rect>
+            </w:pict>
+          </mc:Fallback>
+        </mc:AlternateContent>
+      </w:r>
+      <w:r>
+        <w:rPr>
+          <w:rFonts w:hint="default" w:ascii="Courier New" w:hAnsi="Courier New" w:cs="Courier New"/>
+        </w:rPr>
+        <w:t xml:space="preserve">    res.end('Hello, Node.js!');</w:t>
+      </w:r>
+    </w:p>
+    <w:p>
+      <w:pPr>
+        <w:pStyle w:val="35"/>
+        <w:bidi w:val="0"/>
+        <w:rPr>
+          <w:rFonts w:hint="default" w:ascii="Courier New" w:hAnsi="Courier New" w:cs="Courier New"/>
+        </w:rPr>
+      </w:pPr>
+      <w:r>
+        <w:rPr>
+          <w:rFonts w:hint="default" w:ascii="Courier New" w:hAnsi="Courier New" w:cs="Courier New"/>
+        </w:rPr>
+        <w:t>});</w:t>
+      </w:r>
+    </w:p>
+    <w:p>
+      <w:pPr>
+        <w:pStyle w:val="35"/>
+        <w:bidi w:val="0"/>
+        <w:rPr>
+          <w:rFonts w:hint="default" w:ascii="Courier New" w:hAnsi="Courier New" w:cs="Courier New"/>
+        </w:rPr>
+      </w:pPr>
+      <w:r>
+        <w:rPr>
+          <w:rFonts w:hint="default" w:ascii="Courier New" w:hAnsi="Courier New" w:cs="Courier New"/>
+        </w:rPr>
+        <w:t>// Chạy server tại cổng 3000</w:t>
+      </w:r>
+    </w:p>
+    <w:p>
+      <w:pPr>
+        <w:pStyle w:val="35"/>
+        <w:bidi w:val="0"/>
+        <w:rPr>
+          <w:rFonts w:hint="default" w:ascii="Courier New" w:hAnsi="Courier New" w:cs="Courier New"/>
+        </w:rPr>
+      </w:pPr>
+      <w:r>
+        <w:rPr>
+          <w:rFonts w:hint="default" w:ascii="Courier New" w:hAnsi="Courier New" w:cs="Courier New"/>
+        </w:rPr>
+        <w:t>server.listen(3000, () =&gt; {</w:t>
+      </w:r>
+    </w:p>
+    <w:p>
+      <w:pPr>
+        <w:pStyle w:val="35"/>
+        <w:bidi w:val="0"/>
+        <w:ind w:left="259" w:leftChars="118" w:firstLine="720" w:firstLineChars="277"/>
+        <w:rPr>
+          <w:rFonts w:hint="default" w:ascii="Courier New" w:hAnsi="Courier New" w:cs="Courier New"/>
+        </w:rPr>
+      </w:pPr>
+      <w:r>
+        <w:rPr>
+          <w:rFonts w:hint="default" w:ascii="Courier New" w:hAnsi="Courier New" w:cs="Courier New"/>
+        </w:rPr>
+        <w:t xml:space="preserve">    console.log('Server running at http://localhost:3000/');</w:t>
+      </w:r>
+    </w:p>
+    <w:p>
+      <w:pPr>
+        <w:pStyle w:val="35"/>
+        <w:bidi w:val="0"/>
+        <w:rPr>
+          <w:rFonts w:hint="default" w:ascii="Courier New" w:hAnsi="Courier New" w:cs="Courier New"/>
+          <w:lang w:val="vi-VN"/>
+        </w:rPr>
+      </w:pPr>
+      <w:r>
+        <w:rPr>
+          <w:rFonts w:hint="default" w:ascii="Courier New" w:hAnsi="Courier New" w:cs="Courier New"/>
+        </w:rPr>
+        <w:t>});</w:t>
+      </w:r>
+    </w:p>
+    <w:p>
+      <w:pPr>
+        <w:pStyle w:val="35"/>
+        <w:bidi w:val="0"/>
+        <w:rPr>
+          <w:rFonts w:hint="default" w:ascii="Courier New" w:hAnsi="Courier New" w:cs="Courier New"/>
+          <w:lang w:val="vi-VN"/>
+        </w:rPr>
+      </w:pPr>
+    </w:p>
+    <w:p>
+      <w:pPr>
+        <w:pStyle w:val="4"/>
+        <w:bidi w:val="0"/>
+        <w:rPr>
+          <w:rFonts w:hint="default"/>
+          <w:lang w:val="vi-VN"/>
+        </w:rPr>
+      </w:pPr>
+      <w:bookmarkStart w:id="33" w:name="_Toc3604"/>
+      <w:r>
+        <w:rPr>
+          <w:rFonts w:hint="default"/>
+          <w:lang w:val="vi-VN"/>
+        </w:rPr>
+        <w:t>So sánh giữa Node.js và Spring Boot</w:t>
+      </w:r>
+      <w:bookmarkEnd w:id="33"/>
+    </w:p>
+    <w:tbl>
+      <w:tblPr>
+        <w:tblW w:w="0" w:type="auto"/>
+        <w:tblCellSpacing w:w="15" w:type="dxa"/>
+        <w:tblInd w:w="0" w:type="dxa"/>
+        <w:tblBorders>
+          <w:top w:val="single" w:color="auto" w:sz="4" w:space="0"/>
+          <w:left w:val="single" w:color="auto" w:sz="4" w:space="0"/>
+          <w:bottom w:val="single" w:color="auto" w:sz="4" w:space="0"/>
+          <w:right w:val="single" w:color="auto" w:sz="4" w:space="0"/>
+          <w:insideH w:val="single" w:color="auto" w:sz="4" w:space="0"/>
+          <w:insideV w:val="single" w:color="auto" w:sz="4" w:space="0"/>
+        </w:tblBorders>
+        <w:shd w:val="clear"/>
+        <w:tblLayout w:type="autofit"/>
+        <w:tblCellMar>
+          <w:top w:w="15" w:type="dxa"/>
+          <w:left w:w="15" w:type="dxa"/>
+          <w:bottom w:w="15" w:type="dxa"/>
+          <w:right w:w="15" w:type="dxa"/>
+        </w:tblCellMar>
+      </w:tblPr>
+      <w:tblGrid>
+        <w:gridCol w:w="2070"/>
+        <w:gridCol w:w="3534"/>
+        <w:gridCol w:w="3578"/>
+      </w:tblGrid>
+      <w:tr>
+        <w:tblPrEx>
+          <w:tblBorders>
+            <w:top w:val="single" w:color="auto" w:sz="4" w:space="0"/>
+            <w:left w:val="single" w:color="auto" w:sz="4" w:space="0"/>
+            <w:bottom w:val="single" w:color="auto" w:sz="4" w:space="0"/>
+            <w:right w:val="single" w:color="auto" w:sz="4" w:space="0"/>
+            <w:insideH w:val="single" w:color="auto" w:sz="4" w:space="0"/>
+            <w:insideV w:val="single" w:color="auto" w:sz="4" w:space="0"/>
+          </w:tblBorders>
+          <w:shd w:val="clear"/>
+          <w:tblCellMar>
+            <w:top w:w="15" w:type="dxa"/>
+            <w:left w:w="15" w:type="dxa"/>
+            <w:bottom w:w="15" w:type="dxa"/>
+            <w:right w:w="15" w:type="dxa"/>
+          </w:tblCellMar>
+        </w:tblPrEx>
+        <w:trPr>
+          <w:tblHeader/>
+          <w:tblCellSpacing w:w="15" w:type="dxa"/>
+        </w:trPr>
+        <w:tc>
+          <w:tcPr>
+            <w:tcW w:w="0" w:type="auto"/>
+            <w:shd w:val="clear"/>
+            <w:vAlign w:val="center"/>
+          </w:tcPr>
+          <w:p>
+            <w:pPr>
+              <w:pStyle w:val="35"/>
+              <w:bidi w:val="0"/>
+              <w:ind w:left="0" w:leftChars="0" w:firstLine="0" w:firstLineChars="0"/>
+              <w:jc w:val="center"/>
+              <w:rPr>
+                <w:b/>
+                <w:bCs/>
+              </w:rPr>
+            </w:pPr>
+            <w:r>
+              <w:rPr>
+                <w:b/>
+                <w:bCs/>
+                <w:lang w:val="en-US" w:eastAsia="zh-CN"/>
+              </w:rPr>
+              <w:t>Tiêu chí</w:t>
+            </w:r>
+          </w:p>
+        </w:tc>
+        <w:tc>
+          <w:tcPr>
+            <w:tcW w:w="0" w:type="auto"/>
+            <w:shd w:val="clear"/>
+            <w:vAlign w:val="center"/>
+          </w:tcPr>
+          <w:p>
+            <w:pPr>
+              <w:pStyle w:val="35"/>
+              <w:bidi w:val="0"/>
+              <w:ind w:left="0" w:leftChars="0" w:firstLine="0" w:firstLineChars="0"/>
+              <w:jc w:val="center"/>
+              <w:rPr>
+                <w:b/>
+                <w:bCs/>
+              </w:rPr>
+            </w:pPr>
+            <w:r>
+              <w:rPr>
+                <w:b/>
+                <w:bCs/>
+                <w:lang w:val="en-US" w:eastAsia="zh-CN"/>
+              </w:rPr>
+              <w:t>Node.js</w:t>
+            </w:r>
+          </w:p>
+        </w:tc>
+        <w:tc>
+          <w:tcPr>
+            <w:tcW w:w="0" w:type="auto"/>
+            <w:shd w:val="clear"/>
+            <w:vAlign w:val="center"/>
+          </w:tcPr>
+          <w:p>
+            <w:pPr>
+              <w:pStyle w:val="35"/>
+              <w:bidi w:val="0"/>
+              <w:ind w:left="0" w:leftChars="0" w:firstLine="0" w:firstLineChars="0"/>
+              <w:jc w:val="center"/>
+              <w:rPr>
+                <w:b/>
+                <w:bCs/>
+              </w:rPr>
+            </w:pPr>
+            <w:r>
+              <w:rPr>
+                <w:b/>
+                <w:bCs/>
+                <w:lang w:val="en-US" w:eastAsia="zh-CN"/>
+              </w:rPr>
+              <w:t>Spring Boot</w:t>
+            </w:r>
+          </w:p>
+        </w:tc>
+      </w:tr>
+      <w:tr>
+        <w:tblPrEx>
+          <w:tblBorders>
+            <w:top w:val="single" w:color="auto" w:sz="4" w:space="0"/>
+            <w:left w:val="single" w:color="auto" w:sz="4" w:space="0"/>
+            <w:bottom w:val="single" w:color="auto" w:sz="4" w:space="0"/>
+            <w:right w:val="single" w:color="auto" w:sz="4" w:space="0"/>
+            <w:insideH w:val="single" w:color="auto" w:sz="4" w:space="0"/>
+            <w:insideV w:val="single" w:color="auto" w:sz="4" w:space="0"/>
+          </w:tblBorders>
+          <w:shd w:val="clear"/>
+          <w:tblCellMar>
+            <w:top w:w="15" w:type="dxa"/>
+            <w:left w:w="15" w:type="dxa"/>
+            <w:bottom w:w="15" w:type="dxa"/>
+            <w:right w:w="15" w:type="dxa"/>
+          </w:tblCellMar>
+        </w:tblPrEx>
+        <w:trPr>
+          <w:tblCellSpacing w:w="15" w:type="dxa"/>
+        </w:trPr>
+        <w:tc>
+          <w:tcPr>
+            <w:tcW w:w="0" w:type="auto"/>
+            <w:shd w:val="clear"/>
+            <w:vAlign w:val="center"/>
+          </w:tcPr>
+          <w:p>
+            <w:pPr>
+              <w:pStyle w:val="35"/>
+              <w:bidi w:val="0"/>
+              <w:ind w:left="0" w:leftChars="0" w:firstLine="0" w:firstLineChars="0"/>
+              <w:jc w:val="center"/>
+              <w:rPr>
+                <w:b/>
+                <w:bCs/>
+              </w:rPr>
+            </w:pPr>
+            <w:r>
+              <w:rPr>
+                <w:b/>
+                <w:bCs/>
+                <w:lang w:val="en-US" w:eastAsia="zh-CN"/>
+              </w:rPr>
+              <w:t>Ngôn ngữ</w:t>
+            </w:r>
+          </w:p>
+        </w:tc>
+        <w:tc>
+          <w:tcPr>
+            <w:tcW w:w="0" w:type="auto"/>
+            <w:shd w:val="clear"/>
+            <w:vAlign w:val="center"/>
+          </w:tcPr>
+          <w:p>
+            <w:pPr>
+              <w:pStyle w:val="35"/>
+              <w:bidi w:val="0"/>
+              <w:ind w:left="0" w:leftChars="0" w:firstLine="0" w:firstLineChars="0"/>
+            </w:pPr>
+            <w:r>
+              <w:rPr>
+                <w:lang w:val="en-US" w:eastAsia="zh-CN"/>
+              </w:rPr>
+              <w:t>JavaScript</w:t>
+            </w:r>
+          </w:p>
+        </w:tc>
+        <w:tc>
+          <w:tcPr>
+            <w:tcW w:w="0" w:type="auto"/>
+            <w:shd w:val="clear"/>
+            <w:vAlign w:val="center"/>
+          </w:tcPr>
+          <w:p>
+            <w:pPr>
+              <w:pStyle w:val="35"/>
+              <w:bidi w:val="0"/>
+              <w:ind w:left="0" w:leftChars="0" w:firstLine="0" w:firstLineChars="0"/>
+            </w:pPr>
+            <w:r>
+              <w:rPr>
+                <w:lang w:val="en-US" w:eastAsia="zh-CN"/>
+              </w:rPr>
+              <w:t>Java</w:t>
+            </w:r>
+          </w:p>
+        </w:tc>
+      </w:tr>
+      <w:tr>
+        <w:tblPrEx>
+          <w:tblBorders>
+            <w:top w:val="single" w:color="auto" w:sz="4" w:space="0"/>
+            <w:left w:val="single" w:color="auto" w:sz="4" w:space="0"/>
+            <w:bottom w:val="single" w:color="auto" w:sz="4" w:space="0"/>
+            <w:right w:val="single" w:color="auto" w:sz="4" w:space="0"/>
+            <w:insideH w:val="single" w:color="auto" w:sz="4" w:space="0"/>
+            <w:insideV w:val="single" w:color="auto" w:sz="4" w:space="0"/>
+          </w:tblBorders>
+          <w:shd w:val="clear"/>
+          <w:tblCellMar>
+            <w:top w:w="15" w:type="dxa"/>
+            <w:left w:w="15" w:type="dxa"/>
+            <w:bottom w:w="15" w:type="dxa"/>
+            <w:right w:w="15" w:type="dxa"/>
+          </w:tblCellMar>
+        </w:tblPrEx>
+        <w:trPr>
+          <w:tblCellSpacing w:w="15" w:type="dxa"/>
+        </w:trPr>
+        <w:tc>
+          <w:tcPr>
+            <w:tcW w:w="0" w:type="auto"/>
+            <w:shd w:val="clear"/>
+            <w:vAlign w:val="center"/>
+          </w:tcPr>
+          <w:p>
+            <w:pPr>
+              <w:pStyle w:val="35"/>
+              <w:bidi w:val="0"/>
+              <w:ind w:left="0" w:leftChars="0" w:firstLine="0" w:firstLineChars="0"/>
+              <w:jc w:val="center"/>
+              <w:rPr>
+                <w:b/>
+                <w:bCs/>
+              </w:rPr>
+            </w:pPr>
+            <w:r>
+              <w:rPr>
+                <w:b/>
+                <w:bCs/>
+                <w:lang w:val="en-US" w:eastAsia="zh-CN"/>
+              </w:rPr>
+              <w:t>Mô hình xử lý</w:t>
+            </w:r>
+          </w:p>
+        </w:tc>
+        <w:tc>
+          <w:tcPr>
+            <w:tcW w:w="0" w:type="auto"/>
+            <w:shd w:val="clear"/>
+            <w:vAlign w:val="center"/>
+          </w:tcPr>
+          <w:p>
+            <w:pPr>
+              <w:pStyle w:val="35"/>
+              <w:bidi w:val="0"/>
+              <w:ind w:left="0" w:leftChars="0" w:firstLine="0" w:firstLineChars="0"/>
+            </w:pPr>
+            <w:r>
+              <w:rPr>
+                <w:lang w:val="en-US" w:eastAsia="zh-CN"/>
+              </w:rPr>
+              <w:t>Event-driven, Non-blocking I/O</w:t>
+            </w:r>
+          </w:p>
+        </w:tc>
+        <w:tc>
+          <w:tcPr>
+            <w:tcW w:w="0" w:type="auto"/>
+            <w:shd w:val="clear"/>
+            <w:vAlign w:val="center"/>
+          </w:tcPr>
+          <w:p>
+            <w:pPr>
+              <w:pStyle w:val="35"/>
+              <w:bidi w:val="0"/>
+              <w:ind w:left="0" w:leftChars="0" w:firstLine="0" w:firstLineChars="0"/>
+            </w:pPr>
+            <w:r>
+              <w:rPr>
+                <w:lang w:val="en-US" w:eastAsia="zh-CN"/>
+              </w:rPr>
+              <w:t>Thread-based (Blocking)</w:t>
+            </w:r>
+          </w:p>
+        </w:tc>
+      </w:tr>
+      <w:tr>
+        <w:tblPrEx>
+          <w:tblBorders>
+            <w:top w:val="single" w:color="auto" w:sz="4" w:space="0"/>
+            <w:left w:val="single" w:color="auto" w:sz="4" w:space="0"/>
+            <w:bottom w:val="single" w:color="auto" w:sz="4" w:space="0"/>
+            <w:right w:val="single" w:color="auto" w:sz="4" w:space="0"/>
+            <w:insideH w:val="single" w:color="auto" w:sz="4" w:space="0"/>
+            <w:insideV w:val="single" w:color="auto" w:sz="4" w:space="0"/>
+          </w:tblBorders>
+          <w:shd w:val="clear"/>
+          <w:tblCellMar>
+            <w:top w:w="15" w:type="dxa"/>
+            <w:left w:w="15" w:type="dxa"/>
+            <w:bottom w:w="15" w:type="dxa"/>
+            <w:right w:w="15" w:type="dxa"/>
+          </w:tblCellMar>
+        </w:tblPrEx>
+        <w:trPr>
+          <w:tblCellSpacing w:w="15" w:type="dxa"/>
+        </w:trPr>
+        <w:tc>
+          <w:tcPr>
+            <w:tcW w:w="0" w:type="auto"/>
+            <w:shd w:val="clear"/>
+            <w:vAlign w:val="center"/>
+          </w:tcPr>
+          <w:p>
+            <w:pPr>
+              <w:pStyle w:val="35"/>
+              <w:bidi w:val="0"/>
+              <w:ind w:left="0" w:leftChars="0" w:firstLine="0" w:firstLineChars="0"/>
+              <w:jc w:val="center"/>
+              <w:rPr>
+                <w:b/>
+                <w:bCs/>
+              </w:rPr>
+            </w:pPr>
+            <w:r>
+              <w:rPr>
+                <w:b/>
+                <w:bCs/>
+                <w:lang w:val="en-US" w:eastAsia="zh-CN"/>
+              </w:rPr>
+              <w:t>Hiệu năng</w:t>
+            </w:r>
+          </w:p>
+        </w:tc>
+        <w:tc>
+          <w:tcPr>
+            <w:tcW w:w="0" w:type="auto"/>
+            <w:shd w:val="clear"/>
+            <w:vAlign w:val="center"/>
+          </w:tcPr>
+          <w:p>
+            <w:pPr>
+              <w:pStyle w:val="35"/>
+              <w:bidi w:val="0"/>
+              <w:ind w:left="0" w:leftChars="0" w:firstLine="0" w:firstLineChars="0"/>
+            </w:pPr>
+            <w:r>
+              <w:rPr>
+                <w:lang w:val="en-US" w:eastAsia="zh-CN"/>
+              </w:rPr>
+              <w:t>Tốt với nhiều request đồng thời (I/O nhiều)</w:t>
+            </w:r>
+          </w:p>
+        </w:tc>
+        <w:tc>
+          <w:tcPr>
+            <w:tcW w:w="0" w:type="auto"/>
+            <w:shd w:val="clear"/>
+            <w:vAlign w:val="center"/>
+          </w:tcPr>
+          <w:p>
+            <w:pPr>
+              <w:pStyle w:val="35"/>
+              <w:bidi w:val="0"/>
+              <w:ind w:left="0" w:leftChars="0" w:firstLine="0" w:firstLineChars="0"/>
+            </w:pPr>
+            <w:r>
+              <w:rPr>
+                <w:lang w:val="en-US" w:eastAsia="zh-CN"/>
+              </w:rPr>
+              <w:t>Tốt với xử lý logic phức tạp</w:t>
+            </w:r>
+          </w:p>
+        </w:tc>
+      </w:tr>
+      <w:tr>
+        <w:tblPrEx>
+          <w:tblBorders>
+            <w:top w:val="single" w:color="auto" w:sz="4" w:space="0"/>
+            <w:left w:val="single" w:color="auto" w:sz="4" w:space="0"/>
+            <w:bottom w:val="single" w:color="auto" w:sz="4" w:space="0"/>
+            <w:right w:val="single" w:color="auto" w:sz="4" w:space="0"/>
+            <w:insideH w:val="single" w:color="auto" w:sz="4" w:space="0"/>
+            <w:insideV w:val="single" w:color="auto" w:sz="4" w:space="0"/>
+          </w:tblBorders>
+          <w:shd w:val="clear"/>
+          <w:tblCellMar>
+            <w:top w:w="15" w:type="dxa"/>
+            <w:left w:w="15" w:type="dxa"/>
+            <w:bottom w:w="15" w:type="dxa"/>
+            <w:right w:w="15" w:type="dxa"/>
+          </w:tblCellMar>
+        </w:tblPrEx>
+        <w:trPr>
+          <w:tblCellSpacing w:w="15" w:type="dxa"/>
+        </w:trPr>
+        <w:tc>
+          <w:tcPr>
+            <w:tcW w:w="0" w:type="auto"/>
+            <w:shd w:val="clear"/>
+            <w:vAlign w:val="center"/>
+          </w:tcPr>
+          <w:p>
+            <w:pPr>
+              <w:pStyle w:val="35"/>
+              <w:bidi w:val="0"/>
+              <w:ind w:left="0" w:leftChars="0" w:firstLine="0" w:firstLineChars="0"/>
+              <w:jc w:val="center"/>
+              <w:rPr>
+                <w:b/>
+                <w:bCs/>
+              </w:rPr>
+            </w:pPr>
+            <w:r>
+              <w:rPr>
+                <w:b/>
+                <w:bCs/>
+                <w:lang w:val="en-US" w:eastAsia="zh-CN"/>
+              </w:rPr>
+              <w:t>Đa luồng</w:t>
+            </w:r>
+          </w:p>
+        </w:tc>
+        <w:tc>
+          <w:tcPr>
+            <w:tcW w:w="0" w:type="auto"/>
+            <w:shd w:val="clear"/>
+            <w:vAlign w:val="center"/>
+          </w:tcPr>
+          <w:p>
+            <w:pPr>
+              <w:pStyle w:val="35"/>
+              <w:bidi w:val="0"/>
+              <w:ind w:left="0" w:leftChars="0" w:firstLine="0" w:firstLineChars="0"/>
+            </w:pPr>
+            <w:r>
+              <w:rPr>
+                <w:lang w:val="en-US" w:eastAsia="zh-CN"/>
+              </w:rPr>
+              <w:t>Single-thread (dùng event loop)</w:t>
+            </w:r>
+          </w:p>
+        </w:tc>
+        <w:tc>
+          <w:tcPr>
+            <w:tcW w:w="0" w:type="auto"/>
+            <w:shd w:val="clear"/>
+            <w:vAlign w:val="center"/>
+          </w:tcPr>
+          <w:p>
+            <w:pPr>
+              <w:pStyle w:val="35"/>
+              <w:bidi w:val="0"/>
+              <w:ind w:left="0" w:leftChars="0" w:firstLine="0" w:firstLineChars="0"/>
+            </w:pPr>
+            <w:r>
+              <w:rPr>
+                <w:lang w:val="en-US" w:eastAsia="zh-CN"/>
+              </w:rPr>
+              <w:t>Multi-thread</w:t>
+            </w:r>
+          </w:p>
+        </w:tc>
+      </w:tr>
+      <w:tr>
+        <w:tblPrEx>
+          <w:tblBorders>
+            <w:top w:val="single" w:color="auto" w:sz="4" w:space="0"/>
+            <w:left w:val="single" w:color="auto" w:sz="4" w:space="0"/>
+            <w:bottom w:val="single" w:color="auto" w:sz="4" w:space="0"/>
+            <w:right w:val="single" w:color="auto" w:sz="4" w:space="0"/>
+            <w:insideH w:val="single" w:color="auto" w:sz="4" w:space="0"/>
+            <w:insideV w:val="single" w:color="auto" w:sz="4" w:space="0"/>
+          </w:tblBorders>
+          <w:shd w:val="clear"/>
+          <w:tblCellMar>
+            <w:top w:w="15" w:type="dxa"/>
+            <w:left w:w="15" w:type="dxa"/>
+            <w:bottom w:w="15" w:type="dxa"/>
+            <w:right w:w="15" w:type="dxa"/>
+          </w:tblCellMar>
+        </w:tblPrEx>
+        <w:trPr>
+          <w:tblCellSpacing w:w="15" w:type="dxa"/>
+        </w:trPr>
+        <w:tc>
+          <w:tcPr>
+            <w:tcW w:w="0" w:type="auto"/>
+            <w:shd w:val="clear"/>
+            <w:vAlign w:val="center"/>
+          </w:tcPr>
+          <w:p>
+            <w:pPr>
+              <w:pStyle w:val="35"/>
+              <w:bidi w:val="0"/>
+              <w:ind w:left="0" w:leftChars="0" w:firstLine="0" w:firstLineChars="0"/>
+              <w:jc w:val="center"/>
+              <w:rPr>
+                <w:b/>
+                <w:bCs/>
+              </w:rPr>
+            </w:pPr>
+            <w:r>
+              <w:rPr>
+                <w:b/>
+                <w:bCs/>
+                <w:lang w:val="en-US" w:eastAsia="zh-CN"/>
+              </w:rPr>
+              <w:t>Tốc độ phát triển</w:t>
+            </w:r>
+          </w:p>
+        </w:tc>
+        <w:tc>
+          <w:tcPr>
+            <w:tcW w:w="0" w:type="auto"/>
+            <w:shd w:val="clear"/>
+            <w:vAlign w:val="center"/>
+          </w:tcPr>
+          <w:p>
+            <w:pPr>
+              <w:pStyle w:val="35"/>
+              <w:bidi w:val="0"/>
+              <w:ind w:left="0" w:leftChars="0" w:firstLine="0" w:firstLineChars="0"/>
+            </w:pPr>
+            <w:r>
+              <w:rPr>
+                <w:lang w:val="en-US" w:eastAsia="zh-CN"/>
+              </w:rPr>
+              <w:t>Nhanh, ít cấu hình</w:t>
+            </w:r>
+          </w:p>
+        </w:tc>
+        <w:tc>
+          <w:tcPr>
+            <w:tcW w:w="0" w:type="auto"/>
+            <w:shd w:val="clear"/>
+            <w:vAlign w:val="center"/>
+          </w:tcPr>
+          <w:p>
+            <w:pPr>
+              <w:pStyle w:val="35"/>
+              <w:bidi w:val="0"/>
+              <w:ind w:left="0" w:leftChars="0" w:firstLine="0" w:firstLineChars="0"/>
+            </w:pPr>
+            <w:r>
+              <w:rPr>
+                <w:lang w:val="en-US" w:eastAsia="zh-CN"/>
+              </w:rPr>
+              <w:t>Chậm hơn, cấu hình nhiều hơn</w:t>
+            </w:r>
+          </w:p>
+        </w:tc>
+      </w:tr>
+      <w:tr>
+        <w:tblPrEx>
+          <w:tblBorders>
+            <w:top w:val="single" w:color="auto" w:sz="4" w:space="0"/>
+            <w:left w:val="single" w:color="auto" w:sz="4" w:space="0"/>
+            <w:bottom w:val="single" w:color="auto" w:sz="4" w:space="0"/>
+            <w:right w:val="single" w:color="auto" w:sz="4" w:space="0"/>
+            <w:insideH w:val="single" w:color="auto" w:sz="4" w:space="0"/>
+            <w:insideV w:val="single" w:color="auto" w:sz="4" w:space="0"/>
+          </w:tblBorders>
+          <w:shd w:val="clear"/>
+          <w:tblCellMar>
+            <w:top w:w="15" w:type="dxa"/>
+            <w:left w:w="15" w:type="dxa"/>
+            <w:bottom w:w="15" w:type="dxa"/>
+            <w:right w:w="15" w:type="dxa"/>
+          </w:tblCellMar>
+        </w:tblPrEx>
+        <w:trPr>
+          <w:tblCellSpacing w:w="15" w:type="dxa"/>
+        </w:trPr>
+        <w:tc>
+          <w:tcPr>
+            <w:tcW w:w="0" w:type="auto"/>
+            <w:shd w:val="clear"/>
+            <w:vAlign w:val="center"/>
+          </w:tcPr>
+          <w:p>
+            <w:pPr>
+              <w:pStyle w:val="35"/>
+              <w:bidi w:val="0"/>
+              <w:ind w:left="0" w:leftChars="0" w:firstLine="0" w:firstLineChars="0"/>
+              <w:jc w:val="center"/>
+              <w:rPr>
+                <w:b/>
+                <w:bCs/>
+              </w:rPr>
+            </w:pPr>
+            <w:r>
+              <w:rPr>
+                <w:b/>
+                <w:bCs/>
+                <w:lang w:val="en-US" w:eastAsia="zh-CN"/>
+              </w:rPr>
+              <w:t>Độ phức tạp</w:t>
+            </w:r>
+          </w:p>
+        </w:tc>
+        <w:tc>
+          <w:tcPr>
+            <w:tcW w:w="0" w:type="auto"/>
+            <w:shd w:val="clear"/>
+            <w:vAlign w:val="center"/>
+          </w:tcPr>
+          <w:p>
+            <w:pPr>
+              <w:pStyle w:val="35"/>
+              <w:bidi w:val="0"/>
+              <w:ind w:left="0" w:leftChars="0" w:firstLine="0" w:firstLineChars="0"/>
+            </w:pPr>
+            <w:r>
+              <w:rPr>
+                <w:lang w:val="en-US" w:eastAsia="zh-CN"/>
+              </w:rPr>
+              <w:t>Đơn giản, dễ học</w:t>
+            </w:r>
+          </w:p>
+        </w:tc>
+        <w:tc>
+          <w:tcPr>
+            <w:tcW w:w="0" w:type="auto"/>
+            <w:shd w:val="clear"/>
+            <w:vAlign w:val="center"/>
+          </w:tcPr>
+          <w:p>
+            <w:pPr>
+              <w:pStyle w:val="35"/>
+              <w:bidi w:val="0"/>
+              <w:ind w:left="0" w:leftChars="0" w:firstLine="0" w:firstLineChars="0"/>
+            </w:pPr>
+            <w:r>
+              <w:rPr>
+                <w:lang w:val="en-US" w:eastAsia="zh-CN"/>
+              </w:rPr>
+              <w:t>Phức tạp hơn, nhiều khái niệm</w:t>
+            </w:r>
+          </w:p>
+        </w:tc>
+      </w:tr>
+      <w:tr>
+        <w:tblPrEx>
+          <w:tblBorders>
+            <w:top w:val="single" w:color="auto" w:sz="4" w:space="0"/>
+            <w:left w:val="single" w:color="auto" w:sz="4" w:space="0"/>
+            <w:bottom w:val="single" w:color="auto" w:sz="4" w:space="0"/>
+            <w:right w:val="single" w:color="auto" w:sz="4" w:space="0"/>
+            <w:insideH w:val="single" w:color="auto" w:sz="4" w:space="0"/>
+            <w:insideV w:val="single" w:color="auto" w:sz="4" w:space="0"/>
+          </w:tblBorders>
+          <w:shd w:val="clear"/>
+          <w:tblCellMar>
+            <w:top w:w="15" w:type="dxa"/>
+            <w:left w:w="15" w:type="dxa"/>
+            <w:bottom w:w="15" w:type="dxa"/>
+            <w:right w:w="15" w:type="dxa"/>
+          </w:tblCellMar>
+        </w:tblPrEx>
+        <w:trPr>
+          <w:tblCellSpacing w:w="15" w:type="dxa"/>
+        </w:trPr>
+        <w:tc>
+          <w:tcPr>
+            <w:tcW w:w="0" w:type="auto"/>
+            <w:shd w:val="clear"/>
+            <w:vAlign w:val="center"/>
+          </w:tcPr>
+          <w:p>
+            <w:pPr>
+              <w:pStyle w:val="35"/>
+              <w:bidi w:val="0"/>
+              <w:ind w:left="0" w:leftChars="0" w:firstLine="0" w:firstLineChars="0"/>
+              <w:jc w:val="center"/>
+              <w:rPr>
+                <w:b/>
+                <w:bCs/>
+              </w:rPr>
+            </w:pPr>
+            <w:r>
+              <w:rPr>
+                <w:b/>
+                <w:bCs/>
+                <w:lang w:val="en-US" w:eastAsia="zh-CN"/>
+              </w:rPr>
+              <w:t>Khả năng mở rộng</w:t>
+            </w:r>
+          </w:p>
+        </w:tc>
+        <w:tc>
+          <w:tcPr>
+            <w:tcW w:w="0" w:type="auto"/>
+            <w:shd w:val="clear"/>
+            <w:vAlign w:val="center"/>
+          </w:tcPr>
+          <w:p>
+            <w:pPr>
+              <w:pStyle w:val="35"/>
+              <w:bidi w:val="0"/>
+              <w:ind w:left="0" w:leftChars="0" w:firstLine="0" w:firstLineChars="0"/>
+            </w:pPr>
+            <w:r>
+              <w:rPr>
+                <w:lang w:val="en-US" w:eastAsia="zh-CN"/>
+              </w:rPr>
+              <w:t>Rất tốt cho ứng dụng realtime</w:t>
+            </w:r>
+          </w:p>
+        </w:tc>
+        <w:tc>
+          <w:tcPr>
+            <w:tcW w:w="0" w:type="auto"/>
+            <w:shd w:val="clear"/>
+            <w:vAlign w:val="center"/>
+          </w:tcPr>
+          <w:p>
+            <w:pPr>
+              <w:pStyle w:val="35"/>
+              <w:bidi w:val="0"/>
+              <w:ind w:left="0" w:leftChars="0" w:firstLine="0" w:firstLineChars="0"/>
+            </w:pPr>
+            <w:r>
+              <w:rPr>
+                <w:lang w:val="en-US" w:eastAsia="zh-CN"/>
+              </w:rPr>
+              <w:t>Tốt cho hệ thống lớn, enterprise</w:t>
+            </w:r>
+          </w:p>
+        </w:tc>
+      </w:tr>
+      <w:tr>
+        <w:tblPrEx>
+          <w:tblBorders>
+            <w:top w:val="single" w:color="auto" w:sz="4" w:space="0"/>
+            <w:left w:val="single" w:color="auto" w:sz="4" w:space="0"/>
+            <w:bottom w:val="single" w:color="auto" w:sz="4" w:space="0"/>
+            <w:right w:val="single" w:color="auto" w:sz="4" w:space="0"/>
+            <w:insideH w:val="single" w:color="auto" w:sz="4" w:space="0"/>
+            <w:insideV w:val="single" w:color="auto" w:sz="4" w:space="0"/>
+          </w:tblBorders>
+          <w:shd w:val="clear"/>
+          <w:tblCellMar>
+            <w:top w:w="15" w:type="dxa"/>
+            <w:left w:w="15" w:type="dxa"/>
+            <w:bottom w:w="15" w:type="dxa"/>
+            <w:right w:w="15" w:type="dxa"/>
+          </w:tblCellMar>
+        </w:tblPrEx>
+        <w:trPr>
+          <w:tblCellSpacing w:w="15" w:type="dxa"/>
+        </w:trPr>
+        <w:tc>
+          <w:tcPr>
+            <w:tcW w:w="0" w:type="auto"/>
+            <w:shd w:val="clear"/>
+            <w:vAlign w:val="center"/>
+          </w:tcPr>
+          <w:p>
+            <w:pPr>
+              <w:pStyle w:val="35"/>
+              <w:bidi w:val="0"/>
+              <w:ind w:left="0" w:leftChars="0" w:firstLine="0" w:firstLineChars="0"/>
+              <w:jc w:val="center"/>
+              <w:rPr>
+                <w:b/>
+                <w:bCs/>
+              </w:rPr>
+            </w:pPr>
+            <w:r>
+              <w:rPr>
+                <w:b/>
+                <w:bCs/>
+                <w:lang w:val="en-US" w:eastAsia="zh-CN"/>
+              </w:rPr>
+              <w:t>Quản lý request</w:t>
+            </w:r>
+          </w:p>
+        </w:tc>
+        <w:tc>
+          <w:tcPr>
+            <w:tcW w:w="0" w:type="auto"/>
+            <w:shd w:val="clear"/>
+            <w:vAlign w:val="center"/>
+          </w:tcPr>
+          <w:p>
+            <w:pPr>
+              <w:pStyle w:val="35"/>
+              <w:bidi w:val="0"/>
+              <w:ind w:left="0" w:leftChars="0" w:firstLine="0" w:firstLineChars="0"/>
+            </w:pPr>
+            <w:r>
+              <w:rPr>
+                <w:lang w:val="en-US" w:eastAsia="zh-CN"/>
+              </w:rPr>
+              <w:t>Không chặn (non-blocking)</w:t>
+            </w:r>
+          </w:p>
+        </w:tc>
+        <w:tc>
+          <w:tcPr>
+            <w:tcW w:w="0" w:type="auto"/>
+            <w:shd w:val="clear"/>
+            <w:vAlign w:val="center"/>
+          </w:tcPr>
+          <w:p>
+            <w:pPr>
+              <w:pStyle w:val="35"/>
+              <w:bidi w:val="0"/>
+              <w:ind w:left="0" w:leftChars="0" w:firstLine="0" w:firstLineChars="0"/>
+            </w:pPr>
+            <w:r>
+              <w:rPr>
+                <w:lang w:val="en-US" w:eastAsia="zh-CN"/>
+              </w:rPr>
+              <w:t>Có thể chặn (blocking)</w:t>
+            </w:r>
+          </w:p>
+        </w:tc>
+      </w:tr>
+      <w:tr>
+        <w:tblPrEx>
+          <w:tblBorders>
+            <w:top w:val="single" w:color="auto" w:sz="4" w:space="0"/>
+            <w:left w:val="single" w:color="auto" w:sz="4" w:space="0"/>
+            <w:bottom w:val="single" w:color="auto" w:sz="4" w:space="0"/>
+            <w:right w:val="single" w:color="auto" w:sz="4" w:space="0"/>
+            <w:insideH w:val="single" w:color="auto" w:sz="4" w:space="0"/>
+            <w:insideV w:val="single" w:color="auto" w:sz="4" w:space="0"/>
+          </w:tblBorders>
+          <w:shd w:val="clear"/>
+          <w:tblCellMar>
+            <w:top w:w="15" w:type="dxa"/>
+            <w:left w:w="15" w:type="dxa"/>
+            <w:bottom w:w="15" w:type="dxa"/>
+            <w:right w:w="15" w:type="dxa"/>
+          </w:tblCellMar>
+        </w:tblPrEx>
+        <w:trPr>
+          <w:tblCellSpacing w:w="15" w:type="dxa"/>
+        </w:trPr>
+        <w:tc>
+          <w:tcPr>
+            <w:tcW w:w="0" w:type="auto"/>
+            <w:shd w:val="clear"/>
+            <w:vAlign w:val="center"/>
+          </w:tcPr>
+          <w:p>
+            <w:pPr>
+              <w:pStyle w:val="35"/>
+              <w:bidi w:val="0"/>
+              <w:ind w:left="0" w:leftChars="0" w:firstLine="0" w:firstLineChars="0"/>
+              <w:jc w:val="center"/>
+              <w:rPr>
+                <w:b/>
+                <w:bCs/>
+              </w:rPr>
+            </w:pPr>
+            <w:r>
+              <w:rPr>
+                <w:b/>
+                <w:bCs/>
+                <w:lang w:val="en-US" w:eastAsia="zh-CN"/>
+              </w:rPr>
+              <w:t>Thư viện / hệ sinh thái</w:t>
+            </w:r>
+          </w:p>
+        </w:tc>
+        <w:tc>
+          <w:tcPr>
+            <w:tcW w:w="0" w:type="auto"/>
+            <w:shd w:val="clear"/>
+            <w:vAlign w:val="center"/>
+          </w:tcPr>
+          <w:p>
+            <w:pPr>
+              <w:pStyle w:val="35"/>
+              <w:bidi w:val="0"/>
+              <w:ind w:left="0" w:leftChars="0" w:firstLine="0" w:firstLineChars="0"/>
+            </w:pPr>
+            <w:r>
+              <w:rPr>
+                <w:lang w:val="en-US" w:eastAsia="zh-CN"/>
+              </w:rPr>
+              <w:t>NPM (rất phong phú)</w:t>
+            </w:r>
+          </w:p>
+        </w:tc>
+        <w:tc>
+          <w:tcPr>
+            <w:tcW w:w="0" w:type="auto"/>
+            <w:shd w:val="clear"/>
+            <w:vAlign w:val="center"/>
+          </w:tcPr>
+          <w:p>
+            <w:pPr>
+              <w:pStyle w:val="35"/>
+              <w:bidi w:val="0"/>
+              <w:ind w:left="0" w:leftChars="0" w:firstLine="0" w:firstLineChars="0"/>
+            </w:pPr>
+            <w:r>
+              <w:rPr>
+                <w:lang w:val="en-US" w:eastAsia="zh-CN"/>
+              </w:rPr>
+              <w:t>Maven/Gradle (ổn định, chuẩn enterprise)</w:t>
+            </w:r>
+          </w:p>
+        </w:tc>
+      </w:tr>
+      <w:tr>
+        <w:tblPrEx>
+          <w:tblBorders>
+            <w:top w:val="single" w:color="auto" w:sz="4" w:space="0"/>
+            <w:left w:val="single" w:color="auto" w:sz="4" w:space="0"/>
+            <w:bottom w:val="single" w:color="auto" w:sz="4" w:space="0"/>
+            <w:right w:val="single" w:color="auto" w:sz="4" w:space="0"/>
+            <w:insideH w:val="single" w:color="auto" w:sz="4" w:space="0"/>
+            <w:insideV w:val="single" w:color="auto" w:sz="4" w:space="0"/>
+          </w:tblBorders>
+          <w:shd w:val="clear"/>
+          <w:tblCellMar>
+            <w:top w:w="15" w:type="dxa"/>
+            <w:left w:w="15" w:type="dxa"/>
+            <w:bottom w:w="15" w:type="dxa"/>
+            <w:right w:w="15" w:type="dxa"/>
+          </w:tblCellMar>
+        </w:tblPrEx>
+        <w:trPr>
+          <w:tblCellSpacing w:w="15" w:type="dxa"/>
+        </w:trPr>
+        <w:tc>
+          <w:tcPr>
+            <w:tcW w:w="0" w:type="auto"/>
+            <w:shd w:val="clear"/>
+            <w:vAlign w:val="center"/>
+          </w:tcPr>
+          <w:p>
+            <w:pPr>
+              <w:pStyle w:val="35"/>
+              <w:bidi w:val="0"/>
+              <w:ind w:left="0" w:leftChars="0" w:firstLine="0" w:firstLineChars="0"/>
+              <w:jc w:val="center"/>
+              <w:rPr>
+                <w:b/>
+                <w:bCs/>
+              </w:rPr>
+            </w:pPr>
+            <w:r>
+              <w:rPr>
+                <w:b/>
+                <w:bCs/>
+                <w:lang w:val="en-US" w:eastAsia="zh-CN"/>
+              </w:rPr>
+              <w:t>Ứng dụng phù hợp</w:t>
+            </w:r>
+          </w:p>
+        </w:tc>
+        <w:tc>
+          <w:tcPr>
+            <w:tcW w:w="0" w:type="auto"/>
+            <w:shd w:val="clear"/>
+            <w:vAlign w:val="center"/>
+          </w:tcPr>
+          <w:p>
+            <w:pPr>
+              <w:pStyle w:val="35"/>
+              <w:bidi w:val="0"/>
+              <w:ind w:left="0" w:leftChars="0" w:firstLine="0" w:firstLineChars="0"/>
+            </w:pPr>
+            <w:r>
+              <w:rPr>
+                <w:lang w:val="en-US" w:eastAsia="zh-CN"/>
+              </w:rPr>
+              <w:t>Chat app, API, realtime</w:t>
+            </w:r>
+          </w:p>
+        </w:tc>
+        <w:tc>
+          <w:tcPr>
+            <w:tcW w:w="0" w:type="auto"/>
+            <w:shd w:val="clear"/>
+            <w:vAlign w:val="center"/>
+          </w:tcPr>
+          <w:p>
+            <w:pPr>
+              <w:pStyle w:val="35"/>
+              <w:bidi w:val="0"/>
+              <w:ind w:left="0" w:leftChars="0" w:firstLine="0" w:firstLineChars="0"/>
+            </w:pPr>
+            <w:r>
+              <w:rPr>
+                <w:lang w:val="en-US" w:eastAsia="zh-CN"/>
+              </w:rPr>
+              <w:t>Hệ thống lớn, ngân hàng, ERP</w:t>
+            </w:r>
+          </w:p>
+        </w:tc>
+      </w:tr>
+      <w:tr>
+        <w:tblPrEx>
+          <w:tblBorders>
+            <w:top w:val="single" w:color="auto" w:sz="4" w:space="0"/>
+            <w:left w:val="single" w:color="auto" w:sz="4" w:space="0"/>
+            <w:bottom w:val="single" w:color="auto" w:sz="4" w:space="0"/>
+            <w:right w:val="single" w:color="auto" w:sz="4" w:space="0"/>
+            <w:insideH w:val="single" w:color="auto" w:sz="4" w:space="0"/>
+            <w:insideV w:val="single" w:color="auto" w:sz="4" w:space="0"/>
+          </w:tblBorders>
+          <w:shd w:val="clear"/>
+          <w:tblCellMar>
+            <w:top w:w="15" w:type="dxa"/>
+            <w:left w:w="15" w:type="dxa"/>
+            <w:bottom w:w="15" w:type="dxa"/>
+            <w:right w:w="15" w:type="dxa"/>
+          </w:tblCellMar>
+        </w:tblPrEx>
+        <w:trPr>
+          <w:tblCellSpacing w:w="15" w:type="dxa"/>
+        </w:trPr>
+        <w:tc>
+          <w:tcPr>
+            <w:tcW w:w="0" w:type="auto"/>
+            <w:shd w:val="clear"/>
+            <w:vAlign w:val="center"/>
+          </w:tcPr>
+          <w:p>
+            <w:pPr>
+              <w:pStyle w:val="35"/>
+              <w:bidi w:val="0"/>
+              <w:ind w:left="0" w:leftChars="0" w:firstLine="0" w:firstLineChars="0"/>
+              <w:jc w:val="center"/>
+              <w:rPr>
+                <w:b/>
+                <w:bCs/>
+              </w:rPr>
+            </w:pPr>
+            <w:r>
+              <w:rPr>
+                <w:b/>
+                <w:bCs/>
+                <w:lang w:val="en-US" w:eastAsia="zh-CN"/>
+              </w:rPr>
+              <w:t>Bảo mật</w:t>
+            </w:r>
+          </w:p>
+        </w:tc>
+        <w:tc>
+          <w:tcPr>
+            <w:tcW w:w="0" w:type="auto"/>
+            <w:shd w:val="clear"/>
+            <w:vAlign w:val="center"/>
+          </w:tcPr>
+          <w:p>
+            <w:pPr>
+              <w:pStyle w:val="35"/>
+              <w:bidi w:val="0"/>
+              <w:ind w:left="0" w:leftChars="0" w:firstLine="0" w:firstLineChars="0"/>
+            </w:pPr>
+            <w:r>
+              <w:rPr>
+                <w:lang w:val="en-US" w:eastAsia="zh-CN"/>
+              </w:rPr>
+              <w:t>Phụ thuộc dev nhiều</w:t>
+            </w:r>
+          </w:p>
+        </w:tc>
+        <w:tc>
+          <w:tcPr>
+            <w:tcW w:w="0" w:type="auto"/>
+            <w:shd w:val="clear"/>
+            <w:vAlign w:val="center"/>
+          </w:tcPr>
+          <w:p>
+            <w:pPr>
+              <w:pStyle w:val="35"/>
+              <w:bidi w:val="0"/>
+              <w:ind w:left="0" w:leftChars="0" w:firstLine="0" w:firstLineChars="0"/>
+            </w:pPr>
+            <w:r>
+              <w:rPr>
+                <w:lang w:val="en-US" w:eastAsia="zh-CN"/>
+              </w:rPr>
+              <w:t>Mạnh (Spring Security)</w:t>
+            </w:r>
+          </w:p>
+        </w:tc>
+      </w:tr>
+      <w:tr>
+        <w:tblPrEx>
+          <w:tblBorders>
+            <w:top w:val="single" w:color="auto" w:sz="4" w:space="0"/>
+            <w:left w:val="single" w:color="auto" w:sz="4" w:space="0"/>
+            <w:bottom w:val="single" w:color="auto" w:sz="4" w:space="0"/>
+            <w:right w:val="single" w:color="auto" w:sz="4" w:space="0"/>
+            <w:insideH w:val="single" w:color="auto" w:sz="4" w:space="0"/>
+            <w:insideV w:val="single" w:color="auto" w:sz="4" w:space="0"/>
+          </w:tblBorders>
+          <w:shd w:val="clear"/>
+          <w:tblCellMar>
+            <w:top w:w="15" w:type="dxa"/>
+            <w:left w:w="15" w:type="dxa"/>
+            <w:bottom w:w="15" w:type="dxa"/>
+            <w:right w:w="15" w:type="dxa"/>
+          </w:tblCellMar>
+        </w:tblPrEx>
+        <w:trPr>
+          <w:tblCellSpacing w:w="15" w:type="dxa"/>
+        </w:trPr>
+        <w:tc>
+          <w:tcPr>
+            <w:tcW w:w="0" w:type="auto"/>
+            <w:shd w:val="clear"/>
+            <w:vAlign w:val="center"/>
+          </w:tcPr>
+          <w:p>
+            <w:pPr>
+              <w:pStyle w:val="35"/>
+              <w:bidi w:val="0"/>
+              <w:ind w:left="0" w:leftChars="0" w:firstLine="0" w:firstLineChars="0"/>
+              <w:jc w:val="center"/>
+              <w:rPr>
+                <w:b/>
+                <w:bCs/>
+              </w:rPr>
+            </w:pPr>
+            <w:r>
+              <w:rPr>
+                <w:b/>
+                <w:bCs/>
+                <w:lang w:val="en-US" w:eastAsia="zh-CN"/>
+              </w:rPr>
+              <w:t>Cộng đồng</w:t>
+            </w:r>
+          </w:p>
+        </w:tc>
+        <w:tc>
+          <w:tcPr>
+            <w:tcW w:w="0" w:type="auto"/>
+            <w:shd w:val="clear"/>
+            <w:vAlign w:val="center"/>
+          </w:tcPr>
+          <w:p>
+            <w:pPr>
+              <w:pStyle w:val="35"/>
+              <w:bidi w:val="0"/>
+              <w:ind w:left="0" w:leftChars="0" w:firstLine="0" w:firstLineChars="0"/>
+            </w:pPr>
+            <w:r>
+              <w:rPr>
+                <w:lang w:val="en-US" w:eastAsia="zh-CN"/>
+              </w:rPr>
+              <w:t>Rất lớn</w:t>
+            </w:r>
+          </w:p>
+        </w:tc>
+        <w:tc>
+          <w:tcPr>
+            <w:tcW w:w="0" w:type="auto"/>
+            <w:shd w:val="clear"/>
+            <w:vAlign w:val="center"/>
+          </w:tcPr>
+          <w:p>
+            <w:pPr>
+              <w:pStyle w:val="35"/>
+              <w:bidi w:val="0"/>
+              <w:ind w:left="0" w:leftChars="0" w:firstLine="0" w:firstLineChars="0"/>
+            </w:pPr>
+            <w:r>
+              <w:rPr>
+                <w:lang w:val="en-US" w:eastAsia="zh-CN"/>
+              </w:rPr>
+              <w:t>Rất lớn, lâu đời</w:t>
+            </w:r>
+          </w:p>
+        </w:tc>
+      </w:tr>
+      <w:tr>
+        <w:tblPrEx>
+          <w:tblBorders>
+            <w:top w:val="single" w:color="auto" w:sz="4" w:space="0"/>
+            <w:left w:val="single" w:color="auto" w:sz="4" w:space="0"/>
+            <w:bottom w:val="single" w:color="auto" w:sz="4" w:space="0"/>
+            <w:right w:val="single" w:color="auto" w:sz="4" w:space="0"/>
+            <w:insideH w:val="single" w:color="auto" w:sz="4" w:space="0"/>
+            <w:insideV w:val="single" w:color="auto" w:sz="4" w:space="0"/>
+          </w:tblBorders>
+          <w:shd w:val="clear"/>
+          <w:tblCellMar>
+            <w:top w:w="15" w:type="dxa"/>
+            <w:left w:w="15" w:type="dxa"/>
+            <w:bottom w:w="15" w:type="dxa"/>
+            <w:right w:w="15" w:type="dxa"/>
+          </w:tblCellMar>
+        </w:tblPrEx>
+        <w:trPr>
+          <w:tblCellSpacing w:w="15" w:type="dxa"/>
+        </w:trPr>
+        <w:tc>
+          <w:tcPr>
+            <w:tcW w:w="0" w:type="auto"/>
+            <w:shd w:val="clear"/>
+            <w:vAlign w:val="center"/>
+          </w:tcPr>
+          <w:p>
+            <w:pPr>
+              <w:pStyle w:val="35"/>
+              <w:bidi w:val="0"/>
+              <w:ind w:left="0" w:leftChars="0" w:firstLine="0" w:firstLineChars="0"/>
+              <w:jc w:val="center"/>
+              <w:rPr>
+                <w:b/>
+                <w:bCs/>
+              </w:rPr>
+            </w:pPr>
+            <w:r>
+              <w:rPr>
+                <w:b/>
+                <w:bCs/>
+                <w:lang w:val="en-US" w:eastAsia="zh-CN"/>
+              </w:rPr>
+              <w:t>Triển khai</w:t>
+            </w:r>
+          </w:p>
+        </w:tc>
+        <w:tc>
+          <w:tcPr>
+            <w:tcW w:w="0" w:type="auto"/>
+            <w:shd w:val="clear"/>
+            <w:vAlign w:val="center"/>
+          </w:tcPr>
+          <w:p>
+            <w:pPr>
+              <w:pStyle w:val="35"/>
+              <w:bidi w:val="0"/>
+              <w:ind w:left="0" w:leftChars="0" w:firstLine="0" w:firstLineChars="0"/>
+            </w:pPr>
+            <w:r>
+              <w:rPr>
+                <w:lang w:val="en-US" w:eastAsia="zh-CN"/>
+              </w:rPr>
+              <w:t>Nhẹ, dễ deploy</w:t>
+            </w:r>
+          </w:p>
+        </w:tc>
+        <w:tc>
+          <w:tcPr>
+            <w:tcW w:w="0" w:type="auto"/>
+            <w:shd w:val="clear"/>
+            <w:vAlign w:val="center"/>
+          </w:tcPr>
+          <w:p>
+            <w:pPr>
+              <w:pStyle w:val="35"/>
+              <w:bidi w:val="0"/>
+              <w:ind w:left="0" w:leftChars="0" w:firstLine="0" w:firstLineChars="0"/>
+            </w:pPr>
+            <w:r>
+              <w:rPr>
+                <w:lang w:val="en-US" w:eastAsia="zh-CN"/>
+              </w:rPr>
+              <w:t>Nặng hơn, cần JVM</w:t>
+            </w:r>
+          </w:p>
+        </w:tc>
+      </w:tr>
+    </w:tbl>
+    <w:p>
+      <w:pPr>
+        <w:pStyle w:val="13"/>
+        <w:bidi w:val="0"/>
+        <w:rPr>
+          <w:rFonts w:hint="default"/>
+          <w:lang w:val="vi-VN"/>
+        </w:rPr>
+      </w:pPr>
+      <w:bookmarkStart w:id="34" w:name="_Toc23421"/>
+      <w:r>
+        <w:rPr>
+          <w:rFonts w:hint="default"/>
+          <w:lang w:val="vi-VN"/>
+        </w:rPr>
+        <w:t>Bảng 2.6: So sánh giữa Node.js và Spring Boot</w:t>
+      </w:r>
+      <w:bookmarkEnd w:id="34"/>
+    </w:p>
+    <w:p>
+      <w:pPr>
+        <w:pStyle w:val="13"/>
+        <w:bidi w:val="0"/>
+        <w:rPr>
+          <w:rFonts w:hint="default"/>
+          <w:lang w:val="vi-VN"/>
+        </w:rPr>
+      </w:pPr>
+    </w:p>
+    <w:p>
+      <w:pPr>
+        <w:pStyle w:val="35"/>
+        <w:bidi w:val="0"/>
+        <w:rPr>
+          <w:rFonts w:hint="default"/>
+          <w:lang w:val="vi-VN"/>
+        </w:rPr>
+      </w:pPr>
+      <w:r>
+        <w:rPr>
+          <w:rFonts w:hint="default"/>
+          <w:lang w:val="vi-VN"/>
+        </w:rPr>
+        <w:t xml:space="preserve">Nhận xét: </w:t>
+      </w:r>
+    </w:p>
+    <w:p>
+      <w:pPr>
+        <w:pStyle w:val="35"/>
+        <w:bidi w:val="0"/>
+        <w:rPr>
+          <w:rFonts w:hint="default"/>
+          <w:lang w:val="vi-VN"/>
+        </w:rPr>
+      </w:pPr>
+      <w:r>
+        <w:t>Qua việc so sánh giữa Node.js và Spring Boot, có thể thấy mỗi nền tảng đều có những ưu điểm và hạn chế riêng, phù hợp với từng loại ứng dụng khác nhau. Node.js nổi bật với mô hình xử lý bất đồng bộ (non-blocking I/O) và kiến trúc hướng sự kiện, giúp hệ thống có khả năng xử lý nhiều yêu cầu đồng thời với hiệu năng cao và tiêu tốn ít tài nguyên. Do đó, Node.js rất phù hợp để phát triển các ứng dụng thời gian thực hoặc các hệ thống API có lưu lượng truy cập lớn. Ngược lại, Spring Boot được xây dựng trên nền tảng Java với kiến trúc đa luồng mạnh mẽ, hỗ trợ tốt cho các hệ thống có nghiệp vụ phức tạp, yêu cầu tính ổn định, bảo mật cao và khả năng mở rộng trong môi trường doanh nghiệp. Tuy nhiên, việc phát triển với Spring Boot thường phức tạp hơn và yêu cầu nhiều cấu hình hơn so với Node.js.</w:t>
+      </w:r>
+      <w:r>
+        <w:rPr>
+          <w:rFonts w:hint="default"/>
+          <w:lang w:val="vi-VN"/>
+        </w:rPr>
+        <w:t xml:space="preserve"> </w:t>
+      </w:r>
+    </w:p>
+    <w:p>
+      <w:pPr>
+        <w:pStyle w:val="35"/>
+        <w:bidi w:val="0"/>
+        <w:rPr>
+          <w:rFonts w:hint="default"/>
+          <w:lang w:val="vi-VN"/>
+        </w:rPr>
+      </w:pPr>
+      <w:r>
+        <w:t>Từ đó có thể kết luận rằng, việc lựa chọn công nghệ phụ thuộc chủ yếu vào mục tiêu và quy mô của hệ thống. Đối với các ứng dụng nhỏ đến trung bình, cần phát triển nhanh và tối ưu hiệu năng, Node.js là lựa chọn phù hợp. Trong khi đó, đối với các hệ thống lớn, yêu cầu xử lý nghiệp vụ phức tạp và tính bảo mật cao, Spring Boot sẽ là giải pháp tối ưu hơn.</w:t>
+      </w:r>
     </w:p>
     <w:p>
       <w:pPr>
         <w:pStyle w:val="3"/>
         <w:bidi w:val="0"/>
       </w:pPr>
-      <w:bookmarkStart w:id="30" w:name="_Toc18865"/>
+      <w:bookmarkStart w:id="35" w:name="_Toc16324"/>
       <w:r>
         <w:t>Python</w:t>
       </w:r>
-      <w:bookmarkEnd w:id="30"/>
-      <w:r>
+      <w:bookmarkEnd w:id="35"/>
+    </w:p>
+    <w:p>
+      <w:pPr>
+        <w:pStyle w:val="4"/>
+        <w:bidi w:val="0"/>
+        <w:rPr>
+          <w:rFonts w:hint="default"/>
+          <w:lang w:val="vi-VN"/>
+        </w:rPr>
+      </w:pPr>
+      <w:bookmarkStart w:id="36" w:name="_Toc29946"/>
+      <w:r>
+        <w:rPr>
+          <w:rFonts w:hint="default"/>
+          <w:lang w:val="vi-VN"/>
+        </w:rPr>
+        <w:t>Khái niệm về ngôn ngữ Python</w:t>
+      </w:r>
+      <w:bookmarkEnd w:id="36"/>
+    </w:p>
+    <w:p>
+      <w:pPr>
+        <w:pStyle w:val="35"/>
+        <w:bidi w:val="0"/>
+        <w:rPr>
+          <w:rFonts w:hint="default"/>
+          <w:lang w:val="vi-VN"/>
+        </w:rPr>
+      </w:pPr>
+      <w:r>
+        <w:rPr>
+          <w:rFonts w:hint="default"/>
+          <w:lang w:val="vi-VN"/>
+        </w:rPr>
+        <w:t xml:space="preserve">Python là ngôn ngữ lập trình bậc cao, được thiết kế với mục tiêu là đơn giản hóa cú pháp cho lập trình viên và dễ học với người học lần đâu. Python được phát triển bởi </w:t>
+      </w:r>
+      <w:r>
+        <w:t>Guido van Rossum</w:t>
+      </w:r>
+      <w:r>
+        <w:rPr>
+          <w:rFonts w:hint="default"/>
+          <w:lang w:val="vi-VN"/>
+        </w:rPr>
+        <w:t xml:space="preserve"> và được ra đời lần đầu tiên vào năm 1991. </w:t>
+      </w:r>
+      <w:r>
+        <w:t>Kể từ đó, Python đã trở thành một trong những ngôn ngữ phổ biến nhất trên thế giới nhờ tính linh hoạt, dễ học và khả năng ứng dụng rộng rãi.ác nhà phát triển sử dụng Python vì nó hiệu quả, dễ học và có thể chạy trên nhiều nền tảng khác nhau. Phần mềm Python được tải xuống miễn phí, tích hợp tốt với tất cả các loại hệ thống và tăng tốc độ phát triển.</w:t>
+      </w:r>
+      <w:r>
+        <w:rPr>
+          <w:rFonts w:hint="default"/>
+          <w:lang w:val="vi-VN"/>
+        </w:rPr>
         <w:t xml:space="preserve"> </w:t>
       </w:r>
     </w:p>
     <w:p>
       <w:pPr>
+        <w:pStyle w:val="35"/>
+        <w:bidi w:val="0"/>
+      </w:pPr>
+      <w:r>
+        <w:t>Python còn nổi bật với hệ sinh thái thư viện phong phú, hỗ trợ mạnh mẽ cho nhiều lĩnh vực khác nhau như:</w:t>
+      </w:r>
+    </w:p>
+    <w:p>
+      <w:pPr>
+        <w:pStyle w:val="35"/>
+        <w:bidi w:val="0"/>
+        <w:rPr>
+          <w:rFonts w:hint="default"/>
+        </w:rPr>
+      </w:pPr>
+      <w:r>
+        <w:t>Phát triển web (Django, Flask)</w:t>
+      </w:r>
+      <w:r>
+        <w:rPr>
+          <w:rFonts w:hint="default"/>
+          <w:lang w:val="vi-VN"/>
+        </w:rPr>
+        <w:t xml:space="preserve">. </w:t>
+      </w:r>
+      <w:r>
+        <w:t>Khoa học dữ liệu và trí tuệ nhân tạo</w:t>
+      </w:r>
+      <w:r>
+        <w:rPr>
+          <w:rFonts w:hint="default"/>
+          <w:lang w:val="vi-VN"/>
+        </w:rPr>
+        <w:t xml:space="preserve">. </w:t>
+      </w:r>
+      <w:r>
+        <w:t>Tự động hóa (Automation)</w:t>
+      </w:r>
+      <w:r>
+        <w:rPr>
+          <w:rFonts w:hint="default"/>
+          <w:lang w:val="vi-VN"/>
+        </w:rPr>
+        <w:t xml:space="preserve">. </w:t>
+      </w:r>
+      <w:r>
+        <w:t>Xử lý ảnh, xử lý ngôn ngữ tự nhiên (NLP)</w:t>
+      </w:r>
+      <w:r>
+        <w:rPr>
+          <w:rFonts w:hint="default"/>
+          <w:lang w:val="vi-VN"/>
+        </w:rPr>
+        <w:t xml:space="preserve">. </w:t>
+      </w:r>
+      <w:r>
+        <w:rPr>
+          <w:rFonts w:hint="default"/>
+        </w:rPr>
+        <w:t>Python được sử dụng như</w:t>
+      </w:r>
+      <w:r>
+        <w:rPr>
+          <w:rFonts w:hint="default"/>
+          <w:lang w:val="vi-VN"/>
+        </w:rPr>
+        <w:t xml:space="preserve">: </w:t>
+      </w:r>
+      <w:r>
+        <w:rPr>
+          <w:rFonts w:hint="default"/>
+        </w:rPr>
+        <w:t>Phát triển web phía máy chủ</w:t>
+      </w:r>
+      <w:r>
+        <w:rPr>
+          <w:rFonts w:hint="default"/>
+          <w:lang w:val="vi-VN"/>
+        </w:rPr>
+        <w:t xml:space="preserve">. </w:t>
+      </w:r>
+      <w:r>
+        <w:rPr>
+          <w:rFonts w:hint="default"/>
+        </w:rPr>
+        <w:t>Tự động hóa bằng các tập lệnh Python</w:t>
+      </w:r>
+      <w:r>
+        <w:rPr>
+          <w:rFonts w:hint="default"/>
+          <w:lang w:val="vi-VN"/>
+        </w:rPr>
+        <w:t xml:space="preserve">, </w:t>
+      </w:r>
+      <w:r>
+        <w:rPr>
+          <w:rFonts w:hint="default"/>
+        </w:rPr>
+        <w:t>Khoa học dữ liệu và máy học</w:t>
+      </w:r>
+      <w:r>
+        <w:rPr>
+          <w:rFonts w:hint="default"/>
+          <w:lang w:val="vi-VN"/>
+        </w:rPr>
+        <w:t xml:space="preserve">, </w:t>
+      </w:r>
+      <w:r>
+        <w:rPr>
+          <w:rFonts w:hint="default"/>
+        </w:rPr>
+        <w:t>Phát triển phần mềm</w:t>
+      </w:r>
+      <w:r>
+        <w:rPr>
+          <w:rFonts w:hint="default"/>
+          <w:lang w:val="vi-VN"/>
+        </w:rPr>
+        <w:t xml:space="preserve">, </w:t>
+      </w:r>
+      <w:r>
+        <w:rPr>
+          <w:rFonts w:hint="default"/>
+        </w:rPr>
+        <w:t>Tự động hóa kiểm thử phần mềm</w:t>
+      </w:r>
+    </w:p>
+    <w:p>
+      <w:pPr>
+        <w:pStyle w:val="4"/>
+        <w:bidi w:val="0"/>
+        <w:rPr>
+          <w:rFonts w:hint="default"/>
+          <w:lang w:val="vi-VN"/>
+        </w:rPr>
+      </w:pPr>
+      <w:bookmarkStart w:id="37" w:name="_Toc5047"/>
+      <w:r>
+        <w:rPr>
+          <w:rFonts w:hint="default"/>
+          <w:lang w:val="vi-VN"/>
+        </w:rPr>
+        <w:t>Ứng dụng Python trong dự án</w:t>
+      </w:r>
+      <w:bookmarkEnd w:id="37"/>
+    </w:p>
+    <w:p>
+      <w:pPr>
+        <w:pStyle w:val="35"/>
+        <w:bidi w:val="0"/>
+        <w:rPr>
+          <w:rFonts w:hint="default"/>
+          <w:b/>
+          <w:bCs/>
+          <w:lang w:val="vi-VN"/>
+        </w:rPr>
+      </w:pPr>
+      <w:r>
+        <w:rPr>
+          <w:rFonts w:hint="default"/>
+          <w:b/>
+          <w:bCs/>
+          <w:lang w:val="vi-VN"/>
+        </w:rPr>
+        <w:t>Python được ứng dụng rộng rãi trong dự án về các chức năng sau:</w:t>
+      </w:r>
+    </w:p>
+    <w:p>
+      <w:pPr>
+        <w:pStyle w:val="35"/>
+        <w:bidi w:val="0"/>
+        <w:rPr>
+          <w:rFonts w:hint="default"/>
+          <w:lang w:val="vi-VN"/>
+        </w:rPr>
+      </w:pPr>
+      <w:r>
+        <w:rPr>
+          <w:rFonts w:hint="default"/>
+          <w:lang w:val="vi-VN"/>
+        </w:rPr>
+        <w:t xml:space="preserve">Huấn luyện mô hình SVD và thuật toán Apiori cho phần cá nhân hóa người dùng. Trong dự án có sử dụng chatbot, cụ thể chatbot trong admin để quản lý doanh thu, báo cáo tình hình của nhà hàng. Được huấn luyện để phục vụ cho các chức năng trên. Thư mục ai_service được tách biệt riêng để quản lý các mô hình đã được huấn luyện, cũng như các thuật toán. Nhầm mục đích dễ bảo trì, hạn chế được lỗi. </w:t>
+      </w:r>
+    </w:p>
+    <w:p>
+      <w:pPr>
+        <w:bidi w:val="0"/>
+        <w:jc w:val="center"/>
+      </w:pPr>
+      <w:r>
+        <w:drawing>
+          <wp:inline distT="0" distB="0" distL="114300" distR="114300">
+            <wp:extent cx="3248660" cy="3321685"/>
+            <wp:effectExtent l="0" t="0" r="12700" b="635"/>
+            <wp:docPr id="8" name="Picture 3"/>
+            <wp:cNvGraphicFramePr>
+              <a:graphicFrameLocks xmlns:a="http://schemas.openxmlformats.org/drawingml/2006/main" noChangeAspect="1"/>
+            </wp:cNvGraphicFramePr>
+            <a:graphic xmlns:a="http://schemas.openxmlformats.org/drawingml/2006/main">
+              <a:graphicData uri="http://schemas.openxmlformats.org/drawingml/2006/picture">
+                <pic:pic xmlns:pic="http://schemas.openxmlformats.org/drawingml/2006/picture">
+                  <pic:nvPicPr>
+                    <pic:cNvPr id="8" name="Picture 3"/>
+                    <pic:cNvPicPr>
+                      <a:picLocks noChangeAspect="1"/>
+                    </pic:cNvPicPr>
+                  </pic:nvPicPr>
+                  <pic:blipFill>
+                    <a:blip r:embed="rId15"/>
+                    <a:stretch>
+                      <a:fillRect/>
+                    </a:stretch>
+                  </pic:blipFill>
+                  <pic:spPr>
+                    <a:xfrm>
+                      <a:off x="0" y="0"/>
+                      <a:ext cx="3248660" cy="3321685"/>
+                    </a:xfrm>
+                    <a:prstGeom prst="rect">
+                      <a:avLst/>
+                    </a:prstGeom>
+                    <a:noFill/>
+                    <a:ln>
+                      <a:noFill/>
+                    </a:ln>
+                  </pic:spPr>
+                </pic:pic>
+              </a:graphicData>
+            </a:graphic>
+          </wp:inline>
+        </w:drawing>
+      </w:r>
+    </w:p>
+    <w:p>
+      <w:pPr>
+        <w:pStyle w:val="13"/>
+        <w:bidi w:val="0"/>
+        <w:rPr>
+          <w:rFonts w:hint="default"/>
+          <w:lang w:val="vi-VN"/>
+        </w:rPr>
+      </w:pPr>
+      <w:bookmarkStart w:id="38" w:name="_Toc16544"/>
+      <w:r>
+        <w:rPr>
+          <w:rFonts w:hint="default"/>
+          <w:lang w:val="vi-VN"/>
+        </w:rPr>
+        <w:t>Hình 2.1: Cấu trúc thư mục ai_service trong dự án</w:t>
+      </w:r>
+      <w:bookmarkEnd w:id="38"/>
+    </w:p>
+    <w:p>
+      <w:pPr>
         <w:pStyle w:val="3"/>
         <w:bidi w:val="0"/>
       </w:pPr>
-      <w:bookmarkStart w:id="31" w:name="_Toc2078"/>
+      <w:bookmarkStart w:id="39" w:name="_Toc25809"/>
       <w:r>
         <w:t>Thuật toán SVD</w:t>
       </w:r>
-      <w:bookmarkEnd w:id="31"/>
+      <w:bookmarkEnd w:id="39"/>
+      <w:bookmarkStart w:id="51" w:name="_GoBack"/>
+      <w:bookmarkEnd w:id="51"/>
+    </w:p>
+    <w:p>
+      <w:pPr>
+        <w:pStyle w:val="3"/>
+        <w:bidi w:val="0"/>
+        <w:rPr>
+          <w:rFonts w:hint="default"/>
+          <w:lang w:val="vi-VN"/>
+        </w:rPr>
+      </w:pPr>
+      <w:bookmarkStart w:id="40" w:name="_Toc28735"/>
+      <w:r>
+        <w:rPr>
+          <w:rFonts w:hint="default"/>
+          <w:lang w:val="vi-VN"/>
+        </w:rPr>
+        <w:t>Ứng dụng RAG trong dự án</w:t>
+      </w:r>
+      <w:bookmarkEnd w:id="40"/>
+    </w:p>
+    <w:p>
+      <w:pPr>
+        <w:pStyle w:val="3"/>
+        <w:bidi w:val="0"/>
+      </w:pPr>
+      <w:bookmarkStart w:id="41" w:name="_Toc32183"/>
+      <w:r>
+        <w:t>RESTful API và GraphQL</w:t>
+      </w:r>
+      <w:bookmarkEnd w:id="41"/>
       <w:r>
         <w:t xml:space="preserve"> </w:t>
       </w:r>
@@ -11387,11 +14110,11 @@
         <w:pStyle w:val="3"/>
         <w:bidi w:val="0"/>
       </w:pPr>
-      <w:bookmarkStart w:id="32" w:name="_Toc2490"/>
-      <w:r>
-        <w:t>RESTful API và GraphQL</w:t>
-      </w:r>
-      <w:bookmarkEnd w:id="32"/>
+      <w:bookmarkStart w:id="42" w:name="_Toc569"/>
+      <w:r>
+        <w:t>Thương mại điện tử</w:t>
+      </w:r>
+      <w:bookmarkEnd w:id="42"/>
       <w:r>
         <w:t xml:space="preserve"> </w:t>
       </w:r>
@@ -11401,11 +14124,11 @@
         <w:pStyle w:val="3"/>
         <w:bidi w:val="0"/>
       </w:pPr>
-      <w:bookmarkStart w:id="33" w:name="_Toc28140"/>
-      <w:r>
-        <w:t>Thương mại điện tử</w:t>
-      </w:r>
-      <w:bookmarkEnd w:id="33"/>
+      <w:bookmarkStart w:id="43" w:name="_Toc31071"/>
+      <w:r>
+        <w:t>Thuật toán gợi ý</w:t>
+      </w:r>
+      <w:bookmarkEnd w:id="43"/>
       <w:r>
         <w:t xml:space="preserve"> </w:t>
       </w:r>
@@ -11415,11 +14138,11 @@
         <w:pStyle w:val="3"/>
         <w:bidi w:val="0"/>
       </w:pPr>
-      <w:bookmarkStart w:id="34" w:name="_Toc26427"/>
-      <w:r>
-        <w:t>Thuật toán gợi ý</w:t>
-      </w:r>
-      <w:bookmarkEnd w:id="34"/>
+      <w:bookmarkStart w:id="44" w:name="_Toc9115"/>
+      <w:r>
+        <w:t>NLP</w:t>
+      </w:r>
+      <w:bookmarkEnd w:id="44"/>
       <w:r>
         <w:t xml:space="preserve"> </w:t>
       </w:r>
@@ -11429,11 +14152,11 @@
         <w:pStyle w:val="3"/>
         <w:bidi w:val="0"/>
       </w:pPr>
-      <w:bookmarkStart w:id="35" w:name="_Toc9934"/>
-      <w:r>
-        <w:t>NLP</w:t>
-      </w:r>
-      <w:bookmarkEnd w:id="35"/>
+      <w:bookmarkStart w:id="45" w:name="_Toc23760"/>
+      <w:r>
+        <w:t>Generative AI</w:t>
+      </w:r>
+      <w:bookmarkEnd w:id="45"/>
       <w:r>
         <w:t xml:space="preserve"> </w:t>
       </w:r>
@@ -11443,11 +14166,11 @@
         <w:pStyle w:val="3"/>
         <w:bidi w:val="0"/>
       </w:pPr>
-      <w:bookmarkStart w:id="36" w:name="_Toc19974"/>
-      <w:r>
-        <w:t>Generative AI</w:t>
-      </w:r>
-      <w:bookmarkEnd w:id="36"/>
+      <w:bookmarkStart w:id="46" w:name="_Toc5285"/>
+      <w:r>
+        <w:t>Bảo mật</w:t>
+      </w:r>
+      <w:bookmarkEnd w:id="46"/>
       <w:r>
         <w:t xml:space="preserve"> </w:t>
       </w:r>
@@ -11457,11 +14180,11 @@
         <w:pStyle w:val="3"/>
         <w:bidi w:val="0"/>
       </w:pPr>
-      <w:bookmarkStart w:id="37" w:name="_Toc11575"/>
-      <w:r>
-        <w:t>Bảo mật</w:t>
-      </w:r>
-      <w:bookmarkEnd w:id="37"/>
+      <w:bookmarkStart w:id="47" w:name="_Toc24887"/>
+      <w:r>
+        <w:t>MySQL</w:t>
+      </w:r>
+      <w:bookmarkEnd w:id="47"/>
       <w:r>
         <w:t xml:space="preserve"> </w:t>
       </w:r>
@@ -11471,11 +14194,11 @@
         <w:pStyle w:val="3"/>
         <w:bidi w:val="0"/>
       </w:pPr>
-      <w:bookmarkStart w:id="38" w:name="_Toc15623"/>
-      <w:r>
-        <w:t>MySQL</w:t>
-      </w:r>
-      <w:bookmarkEnd w:id="38"/>
+      <w:bookmarkStart w:id="48" w:name="_Toc1021"/>
+      <w:r>
+        <w:t>API thanh toán MoMo</w:t>
+      </w:r>
+      <w:bookmarkEnd w:id="48"/>
       <w:r>
         <w:t xml:space="preserve"> </w:t>
       </w:r>
@@ -11485,32 +14208,18 @@
         <w:pStyle w:val="3"/>
         <w:bidi w:val="0"/>
       </w:pPr>
-      <w:bookmarkStart w:id="39" w:name="_Toc16803"/>
-      <w:r>
-        <w:t>API thanh toán MoMo</w:t>
-      </w:r>
-      <w:bookmarkEnd w:id="39"/>
-      <w:r>
-        <w:t xml:space="preserve"> </w:t>
-      </w:r>
+      <w:bookmarkStart w:id="49" w:name="_Toc5161"/>
+      <w:r>
+        <w:t>Nghiệp vụ hệ thống</w:t>
+      </w:r>
+      <w:bookmarkEnd w:id="49"/>
     </w:p>
     <w:p>
       <w:pPr>
         <w:pStyle w:val="3"/>
         <w:bidi w:val="0"/>
       </w:pPr>
-      <w:bookmarkStart w:id="40" w:name="_Toc8986"/>
-      <w:r>
-        <w:t>Nghiệp vụ hệ thống</w:t>
-      </w:r>
-      <w:bookmarkEnd w:id="40"/>
-    </w:p>
-    <w:p>
-      <w:pPr>
-        <w:pStyle w:val="3"/>
-        <w:bidi w:val="0"/>
-      </w:pPr>
-      <w:bookmarkStart w:id="41" w:name="_Toc20097"/>
+      <w:bookmarkStart w:id="50" w:name="_Toc1118"/>
       <w:r>
         <w:rPr>
           <w:rFonts w:hint="default"/>
@@ -11518,7 +14227,7 @@
         </w:rPr>
         <w:t>Các công trình nghiên cứu liên quan</w:t>
       </w:r>
-      <w:bookmarkEnd w:id="41"/>
+      <w:bookmarkEnd w:id="50"/>
     </w:p>
     <w:p>
       <w:pPr>

</xml_diff>